<commit_message>
Deux schémas à légender (racine, arc réflexe) : images originales sans texte, corrigés détaillés, support image dans md2docx
Co-authored-by: arena-agent <297053741+arena-agent@users.noreply.github.com>
</commit_message>
<xml_diff>
--- a/Note-de-synthese-ecarts-SVT-T9.docx
+++ b/Note-de-synthese-ecarts-SVT-T9.docx
@@ -191,7 +191,7 @@
           <w:b/>
           <w:i w:val="0"/>
         </w:rPr>
-        <w:t>33 écarts</w:t>
+        <w:t>34 écarts</w:t>
       </w:r>
       <w:r>
         <w:rPr>
@@ -727,7 +727,7 @@
                 <w:i w:val="0"/>
                 <w:sz w:val="17"/>
               </w:rPr>
-              <w:t>7</w:t>
+              <w:t>8</w:t>
             </w:r>
           </w:p>
         </w:tc>
@@ -808,7 +808,7 @@
                 <w:i w:val="0"/>
                 <w:sz w:val="17"/>
               </w:rPr>
-              <w:t>33</w:t>
+              <w:t>34</w:t>
             </w:r>
           </w:p>
         </w:tc>
@@ -1530,7 +1530,7 @@
                 <w:i w:val="0"/>
                 <w:sz w:val="17"/>
               </w:rPr>
-              <w:t>2</w:t>
+              <w:t>3</w:t>
             </w:r>
           </w:p>
         </w:tc>
@@ -6965,6 +6965,164 @@
           </w:p>
         </w:tc>
       </w:tr>
+      <w:tr>
+        <w:tc>
+          <w:tcPr>
+            <w:tcW w:type="dxa" w:w="3535"/>
+            <w:tcBorders>
+              <w:top w:val="single" w:sz="4" w:color="999999"/>
+              <w:left w:val="single" w:sz="4" w:color="999999"/>
+              <w:bottom w:val="single" w:sz="4" w:color="999999"/>
+              <w:right w:val="single" w:sz="4" w:color="999999"/>
+            </w:tcBorders>
+          </w:tcPr>
+          <w:p>
+            <w:pPr>
+              <w:spacing w:before="20" w:after="20"/>
+            </w:pPr>
+            <w:r>
+              <w:rPr>
+                <w:sz w:val="17"/>
+              </w:rPr>
+            </w:r>
+            <w:r>
+              <w:rPr>
+                <w:b/>
+                <w:i w:val="0"/>
+                <w:sz w:val="17"/>
+              </w:rPr>
+              <w:t>A8</w:t>
+            </w:r>
+          </w:p>
+        </w:tc>
+        <w:tc>
+          <w:tcPr>
+            <w:tcW w:type="dxa" w:w="3535"/>
+            <w:tcBorders>
+              <w:top w:val="single" w:sz="4" w:color="999999"/>
+              <w:left w:val="single" w:sz="4" w:color="999999"/>
+              <w:bottom w:val="single" w:sz="4" w:color="999999"/>
+              <w:right w:val="single" w:sz="4" w:color="999999"/>
+            </w:tcBorders>
+          </w:tcPr>
+          <w:p>
+            <w:pPr>
+              <w:spacing w:before="20" w:after="20"/>
+            </w:pPr>
+            <w:r>
+              <w:rPr>
+                <w:sz w:val="17"/>
+              </w:rPr>
+            </w:r>
+            <w:r>
+              <w:rPr>
+                <w:b/>
+                <w:i w:val="0"/>
+                <w:sz w:val="17"/>
+              </w:rPr>
+              <w:t>Deux schémas à légender</w:t>
+            </w:r>
+            <w:r>
+              <w:rPr>
+                <w:b w:val="0"/>
+                <w:i w:val="0"/>
+                <w:sz w:val="17"/>
+              </w:rPr>
+              <w:t xml:space="preserve"> : extrémité de racine, arc réflexe</w:t>
+            </w:r>
+          </w:p>
+        </w:tc>
+        <w:tc>
+          <w:tcPr>
+            <w:tcW w:type="dxa" w:w="3535"/>
+            <w:tcBorders>
+              <w:top w:val="single" w:sz="4" w:color="999999"/>
+              <w:left w:val="single" w:sz="4" w:color="999999"/>
+              <w:bottom w:val="single" w:sz="4" w:color="999999"/>
+              <w:right w:val="single" w:sz="4" w:color="999999"/>
+            </w:tcBorders>
+          </w:tcPr>
+          <w:p>
+            <w:pPr>
+              <w:spacing w:before="20" w:after="20"/>
+            </w:pPr>
+            <w:r>
+              <w:rPr>
+                <w:sz w:val="17"/>
+              </w:rPr>
+            </w:r>
+            <w:r>
+              <w:rPr>
+                <w:b w:val="0"/>
+                <w:i w:val="0"/>
+                <w:sz w:val="17"/>
+              </w:rPr>
+              <w:t>24, 35</w:t>
+            </w:r>
+          </w:p>
+        </w:tc>
+        <w:tc>
+          <w:tcPr>
+            <w:tcW w:type="dxa" w:w="3535"/>
+            <w:tcBorders>
+              <w:top w:val="single" w:sz="4" w:color="999999"/>
+              <w:left w:val="single" w:sz="4" w:color="999999"/>
+              <w:bottom w:val="single" w:sz="4" w:color="999999"/>
+              <w:right w:val="single" w:sz="4" w:color="999999"/>
+            </w:tcBorders>
+          </w:tcPr>
+          <w:p>
+            <w:pPr>
+              <w:spacing w:before="20" w:after="20"/>
+            </w:pPr>
+            <w:r>
+              <w:rPr>
+                <w:sz w:val="17"/>
+              </w:rPr>
+            </w:r>
+            <w:r>
+              <w:rPr>
+                <w:b w:val="0"/>
+                <w:i w:val="0"/>
+                <w:sz w:val="17"/>
+              </w:rPr>
+              <w:t xml:space="preserve">Le manuel d'origine annonçait « Schéma à légender » dans vingt légendes d'images sans qu'aucun exercice de légendage n'existe. Les deux schémas sont </w:t>
+            </w:r>
+            <w:r>
+              <w:rPr>
+                <w:b/>
+                <w:i w:val="0"/>
+                <w:sz w:val="17"/>
+              </w:rPr>
+              <w:t>originaux</w:t>
+            </w:r>
+            <w:r>
+              <w:rPr>
+                <w:b w:val="0"/>
+                <w:i w:val="0"/>
+                <w:sz w:val="17"/>
+              </w:rPr>
+              <w:t xml:space="preserve">, dessinés pour ce manuel, et </w:t>
+            </w:r>
+            <w:r>
+              <w:rPr>
+                <w:b/>
+                <w:i w:val="0"/>
+                <w:sz w:val="17"/>
+              </w:rPr>
+              <w:t>volontairement dépourvus de texte</w:t>
+            </w:r>
+            <w:r>
+              <w:rPr>
+                <w:b w:val="0"/>
+                <w:i w:val="0"/>
+                <w:sz w:val="17"/>
+              </w:rPr>
+              <w:t xml:space="preserve"> : les noms sont à placer par l'élève. Aucune image du FRP n'a été reprise</w:t>
+            </w:r>
+          </w:p>
+        </w:tc>
+      </w:tr>
     </w:tbl>
     <w:p/>
     <w:p>
@@ -8545,7 +8703,7 @@
           <w:b/>
           <w:i w:val="0"/>
         </w:rPr>
-        <w:t>trente et un autres</w:t>
+        <w:t>trente-deux autres</w:t>
       </w:r>
       <w:r>
         <w:rPr>

</xml_diff>

<commit_message>
Six illustrations du pack rapprochées des séances 13, 14, 16, 19 et 30 ; écart A9 (35 écarts) ; relevé des anomalies du pack d'illustrations
Co-authored-by: arena-agent <297053741+arena-agent@users.noreply.github.com>
</commit_message>
<xml_diff>
--- a/Note-de-synthese-ecarts-SVT-T9.docx
+++ b/Note-de-synthese-ecarts-SVT-T9.docx
@@ -191,7 +191,7 @@
           <w:b/>
           <w:i w:val="0"/>
         </w:rPr>
-        <w:t>34 écarts</w:t>
+        <w:t>35 écarts</w:t>
       </w:r>
       <w:r>
         <w:rPr>
@@ -727,7 +727,7 @@
                 <w:i w:val="0"/>
                 <w:sz w:val="17"/>
               </w:rPr>
-              <w:t>8</w:t>
+              <w:t>9</w:t>
             </w:r>
           </w:p>
         </w:tc>
@@ -808,7 +808,7 @@
                 <w:i w:val="0"/>
                 <w:sz w:val="17"/>
               </w:rPr>
-              <w:t>34</w:t>
+              <w:t>35</w:t>
             </w:r>
           </w:p>
         </w:tc>
@@ -1085,7 +1085,7 @@
                 <w:i w:val="0"/>
                 <w:sz w:val="17"/>
               </w:rPr>
-              <w:t>4</w:t>
+              <w:t>5</w:t>
             </w:r>
           </w:p>
         </w:tc>
@@ -6961,6 +6961,181 @@
                 <w:sz w:val="17"/>
               </w:rPr>
               <w:t xml:space="preserve"> du PE</w:t>
+            </w:r>
+          </w:p>
+        </w:tc>
+      </w:tr>
+      <w:tr>
+        <w:tc>
+          <w:tcPr>
+            <w:tcW w:type="dxa" w:w="3535"/>
+            <w:tcBorders>
+              <w:top w:val="single" w:sz="4" w:color="999999"/>
+              <w:left w:val="single" w:sz="4" w:color="999999"/>
+              <w:bottom w:val="single" w:sz="4" w:color="999999"/>
+              <w:right w:val="single" w:sz="4" w:color="999999"/>
+            </w:tcBorders>
+          </w:tcPr>
+          <w:p>
+            <w:pPr>
+              <w:spacing w:before="20" w:after="20"/>
+            </w:pPr>
+            <w:r>
+              <w:rPr>
+                <w:sz w:val="17"/>
+              </w:rPr>
+            </w:r>
+            <w:r>
+              <w:rPr>
+                <w:b/>
+                <w:i w:val="0"/>
+                <w:sz w:val="17"/>
+              </w:rPr>
+              <w:t>A9</w:t>
+            </w:r>
+          </w:p>
+        </w:tc>
+        <w:tc>
+          <w:tcPr>
+            <w:tcW w:type="dxa" w:w="3535"/>
+            <w:tcBorders>
+              <w:top w:val="single" w:sz="4" w:color="999999"/>
+              <w:left w:val="single" w:sz="4" w:color="999999"/>
+              <w:bottom w:val="single" w:sz="4" w:color="999999"/>
+              <w:right w:val="single" w:sz="4" w:color="999999"/>
+            </w:tcBorders>
+          </w:tcPr>
+          <w:p>
+            <w:pPr>
+              <w:spacing w:before="20" w:after="20"/>
+            </w:pPr>
+            <w:r>
+              <w:rPr>
+                <w:sz w:val="17"/>
+              </w:rPr>
+            </w:r>
+            <w:r>
+              <w:rPr>
+                <w:b/>
+                <w:i w:val="0"/>
+                <w:sz w:val="17"/>
+              </w:rPr>
+              <w:t>Six illustrations en page LEÇON</w:t>
+            </w:r>
+            <w:r>
+              <w:rPr>
+                <w:b w:val="0"/>
+                <w:i w:val="0"/>
+                <w:sz w:val="17"/>
+              </w:rPr>
+              <w:t xml:space="preserve"> (13, 14, 16, 19, 30)</w:t>
+            </w:r>
+          </w:p>
+        </w:tc>
+        <w:tc>
+          <w:tcPr>
+            <w:tcW w:type="dxa" w:w="3535"/>
+            <w:tcBorders>
+              <w:top w:val="single" w:sz="4" w:color="999999"/>
+              <w:left w:val="single" w:sz="4" w:color="999999"/>
+              <w:bottom w:val="single" w:sz="4" w:color="999999"/>
+              <w:right w:val="single" w:sz="4" w:color="999999"/>
+            </w:tcBorders>
+          </w:tcPr>
+          <w:p>
+            <w:pPr>
+              <w:spacing w:before="20" w:after="20"/>
+            </w:pPr>
+            <w:r>
+              <w:rPr>
+                <w:sz w:val="17"/>
+              </w:rPr>
+            </w:r>
+            <w:r>
+              <w:rPr>
+                <w:b w:val="0"/>
+                <w:i w:val="0"/>
+                <w:sz w:val="17"/>
+              </w:rPr>
+              <w:t>13, 14, 16, 19, 30</w:t>
+            </w:r>
+          </w:p>
+        </w:tc>
+        <w:tc>
+          <w:tcPr>
+            <w:tcW w:type="dxa" w:w="3535"/>
+            <w:tcBorders>
+              <w:top w:val="single" w:sz="4" w:color="999999"/>
+              <w:left w:val="single" w:sz="4" w:color="999999"/>
+              <w:bottom w:val="single" w:sz="4" w:color="999999"/>
+              <w:right w:val="single" w:sz="4" w:color="999999"/>
+            </w:tcBorders>
+          </w:tcPr>
+          <w:p>
+            <w:pPr>
+              <w:spacing w:before="20" w:after="20"/>
+            </w:pPr>
+            <w:r>
+              <w:rPr>
+                <w:sz w:val="17"/>
+              </w:rPr>
+            </w:r>
+            <w:r>
+              <w:rPr>
+                <w:b w:val="0"/>
+                <w:i w:val="0"/>
+                <w:sz w:val="17"/>
+              </w:rPr>
+              <w:t xml:space="preserve">Le dépôt </w:t>
+            </w:r>
+            <w:r>
+              <w:rPr>
+                <w:rFonts w:ascii="Consolas" w:hAnsi="Consolas"/>
+                <w:b w:val="0"/>
+                <w:i w:val="0"/>
+                <w:sz w:val="17"/>
+              </w:rPr>
+              <w:t>jlearn-pack</w:t>
+            </w:r>
+            <w:r>
+              <w:rPr>
+                <w:b w:val="0"/>
+                <w:i w:val="0"/>
+                <w:sz w:val="17"/>
+              </w:rPr>
+              <w:t xml:space="preserve"> contient 41 illustrations servies par CDN, dont aucune n'était utilisée par les pages de leçon. Six ont été rapprochées des séances dont le texte les décrit déjà : plante entière, criquet, poule, zébu, plus les deux schémas muets réemployés en leçon avant l'examen. Les images du pack </w:t>
+            </w:r>
+            <w:r>
+              <w:rPr>
+                <w:b/>
+                <w:i w:val="0"/>
+                <w:sz w:val="17"/>
+              </w:rPr>
+              <w:t>sans correspondance réelle</w:t>
+            </w:r>
+            <w:r>
+              <w:rPr>
+                <w:b w:val="0"/>
+                <w:i w:val="0"/>
+                <w:sz w:val="17"/>
+              </w:rPr>
+              <w:t xml:space="preserve"> (appareil digestif, habitat humain, vaccination d'un enfant) ont été </w:t>
+            </w:r>
+            <w:r>
+              <w:rPr>
+                <w:b/>
+                <w:i w:val="0"/>
+                <w:sz w:val="17"/>
+              </w:rPr>
+              <w:t>écartées</w:t>
+            </w:r>
+            <w:r>
+              <w:rPr>
+                <w:b w:val="0"/>
+                <w:i w:val="0"/>
+                <w:sz w:val="17"/>
+              </w:rPr>
+              <w:t xml:space="preserve"> : aucune séance du programme T9 ne les traite</w:t>
             </w:r>
           </w:p>
         </w:tc>

</xml_diff>

<commit_message>
Séance 16 : illustration du rat des champs (image du pack jusque-là inutilisée) ; A9 documente l'inspection des 34 images écartées et leurs motifs
Co-authored-by: arena-agent <297053741+arena-agent@users.noreply.github.com>
</commit_message>
<xml_diff>
--- a/Note-de-synthese-ecarts-SVT-T9.docx
+++ b/Note-de-synthese-ecarts-SVT-T9.docx
@@ -7020,7 +7020,7 @@
                 <w:i w:val="0"/>
                 <w:sz w:val="17"/>
               </w:rPr>
-              <w:t>Six illustrations en page LEÇON</w:t>
+              <w:t>Sept illustrations en page LEÇON</w:t>
             </w:r>
             <w:r>
               <w:rPr>
@@ -7028,7 +7028,7 @@
                 <w:i w:val="0"/>
                 <w:sz w:val="17"/>
               </w:rPr>
-              <w:t xml:space="preserve"> (13, 14, 16, 19, 30)</w:t>
+              <w:t xml:space="preserve"> (13, 14, 16 ×2, 19, 30)</w:t>
             </w:r>
           </w:p>
         </w:tc>
@@ -7103,7 +7103,7 @@
                 <w:i w:val="0"/>
                 <w:sz w:val="17"/>
               </w:rPr>
-              <w:t xml:space="preserve"> contient 41 illustrations servies par CDN, dont aucune n'était utilisée par les pages de leçon. Six ont été rapprochées des séances dont le texte les décrit déjà : plante entière, criquet, poule, zébu, plus les deux schémas muets réemployés en leçon avant l'examen. Les images du pack </w:t>
+              <w:t xml:space="preserve"> contient 41 illustrations servies par CDN, dont aucune n'était utilisée par les pages de leçon. Sept ont été rapprochées des séances dont le texte les décrit déjà : plante entière, criquet, </w:t>
             </w:r>
             <w:r>
               <w:rPr>
@@ -7111,7 +7111,7 @@
                 <w:i w:val="0"/>
                 <w:sz w:val="17"/>
               </w:rPr>
-              <w:t>sans correspondance réelle</w:t>
+              <w:t>rat des champs</w:t>
             </w:r>
             <w:r>
               <w:rPr>
@@ -7119,7 +7119,7 @@
                 <w:i w:val="0"/>
                 <w:sz w:val="17"/>
               </w:rPr>
-              <w:t xml:space="preserve"> (appareil digestif, habitat humain, vaccination d'un enfant) ont été </w:t>
+              <w:t xml:space="preserve"> (la séance 16 cite les rats parmi les ravageurs sans les montrer ; le commentaire précise qu'ils s'attaquent surtout au </w:t>
             </w:r>
             <w:r>
               <w:rPr>
@@ -7127,7 +7127,7 @@
                 <w:i w:val="0"/>
                 <w:sz w:val="17"/>
               </w:rPr>
-              <w:t>écartées</w:t>
+              <w:t>riz stocké</w:t>
             </w:r>
             <w:r>
               <w:rPr>
@@ -7135,7 +7135,81 @@
                 <w:i w:val="0"/>
                 <w:sz w:val="17"/>
               </w:rPr>
-              <w:t xml:space="preserve"> : aucune séance du programme T9 ne les traite</w:t>
+              <w:t xml:space="preserve">), poule, zébu, plus les deux schémas muets réemployés en leçon avant l'examen. Les 34 images restantes ont été </w:t>
+            </w:r>
+            <w:r>
+              <w:rPr>
+                <w:b/>
+                <w:i w:val="0"/>
+                <w:sz w:val="17"/>
+              </w:rPr>
+              <w:t>inspectées une à une, puis écartées</w:t>
+            </w:r>
+            <w:r>
+              <w:rPr>
+                <w:b w:val="0"/>
+                <w:i w:val="0"/>
+                <w:sz w:val="17"/>
+              </w:rPr>
+              <w:t xml:space="preserve"> pour trois motifs : hors programme T9 (appareil digestif, fleur en coupe) ; </w:t>
+            </w:r>
+            <w:r>
+              <w:rPr>
+                <w:b/>
+                <w:i w:val="0"/>
+                <w:sz w:val="17"/>
+              </w:rPr>
+              <w:t>texte parasite incrusté</w:t>
+            </w:r>
+            <w:r>
+              <w:rPr>
+                <w:b w:val="0"/>
+                <w:i w:val="0"/>
+                <w:sz w:val="17"/>
+              </w:rPr>
+              <w:t xml:space="preserve"> — </w:t>
+            </w:r>
+            <w:r>
+              <w:rPr>
+                <w:rFonts w:ascii="Consolas" w:hAnsi="Consolas"/>
+                <w:b w:val="0"/>
+                <w:i w:val="0"/>
+                <w:sz w:val="17"/>
+              </w:rPr>
+              <w:t>falaise_strates.png</w:t>
+            </w:r>
+            <w:r>
+              <w:rPr>
+                <w:b w:val="0"/>
+                <w:i w:val="0"/>
+                <w:sz w:val="17"/>
+              </w:rPr>
+              <w:t xml:space="preserve"> porte le mot inexistant « Sounitet », </w:t>
+            </w:r>
+            <w:r>
+              <w:rPr>
+                <w:rFonts w:ascii="Consolas" w:hAnsi="Consolas"/>
+                <w:b w:val="0"/>
+                <w:i w:val="0"/>
+                <w:sz w:val="17"/>
+              </w:rPr>
+              <w:t>svt9e_vaccination.png</w:t>
+            </w:r>
+            <w:r>
+              <w:rPr>
+                <w:b w:val="0"/>
+                <w:i w:val="0"/>
+                <w:sz w:val="17"/>
+              </w:rPr>
+              <w:t xml:space="preserve"> un flacon illisible ; ou sujet inadapté (vaccination d'un enfant là où la séance 21 traite du bétail). </w:t>
+            </w:r>
+            <w:r>
+              <w:rPr>
+                <w:b/>
+                <w:i w:val="0"/>
+                <w:sz w:val="17"/>
+              </w:rPr>
+              <w:t>Une image approximative nuit plus qu'elle n'aide</w:t>
             </w:r>
           </w:p>
         </w:tc>

</xml_diff>

<commit_message>
Page de garde : tableau de répartition du volume horaire (66 h / 51 séances) et point de vigilance sur l'Unité I, seule unité en déficit ; écart A10
Co-authored-by: arena-agent <297053741+arena-agent@users.noreply.github.com>
</commit_message>
<xml_diff>
--- a/Note-de-synthese-ecarts-SVT-T9.docx
+++ b/Note-de-synthese-ecarts-SVT-T9.docx
@@ -191,7 +191,7 @@
           <w:b/>
           <w:i w:val="0"/>
         </w:rPr>
-        <w:t>35 écarts</w:t>
+        <w:t>36 écarts</w:t>
       </w:r>
       <w:r>
         <w:rPr>
@@ -727,7 +727,7 @@
                 <w:i w:val="0"/>
                 <w:sz w:val="17"/>
               </w:rPr>
-              <w:t>9</w:t>
+              <w:t>10</w:t>
             </w:r>
           </w:p>
         </w:tc>
@@ -808,7 +808,7 @@
                 <w:i w:val="0"/>
                 <w:sz w:val="17"/>
               </w:rPr>
-              <w:t>35</w:t>
+              <w:t>36</w:t>
             </w:r>
           </w:p>
         </w:tc>
@@ -1531,6 +1531,95 @@
                 <w:sz w:val="17"/>
               </w:rPr>
               <w:t>3</w:t>
+            </w:r>
+          </w:p>
+        </w:tc>
+        <w:tc>
+          <w:tcPr>
+            <w:tcW w:type="dxa" w:w="4713"/>
+            <w:tcBorders>
+              <w:top w:val="single" w:sz="4" w:color="999999"/>
+              <w:left w:val="single" w:sz="4" w:color="999999"/>
+              <w:bottom w:val="single" w:sz="4" w:color="999999"/>
+              <w:right w:val="single" w:sz="4" w:color="999999"/>
+            </w:tcBorders>
+          </w:tcPr>
+          <w:p>
+            <w:pPr>
+              <w:spacing w:before="20" w:after="20"/>
+            </w:pPr>
+            <w:r>
+              <w:rPr>
+                <w:sz w:val="17"/>
+              </w:rPr>
+            </w:r>
+            <w:r>
+              <w:rPr>
+                <w:b w:val="0"/>
+                <w:i w:val="0"/>
+                <w:sz w:val="17"/>
+              </w:rPr>
+              <w:t>—</w:t>
+            </w:r>
+          </w:p>
+        </w:tc>
+      </w:tr>
+      <w:tr>
+        <w:tc>
+          <w:tcPr>
+            <w:tcW w:type="dxa" w:w="4713"/>
+            <w:tcBorders>
+              <w:top w:val="single" w:sz="4" w:color="999999"/>
+              <w:left w:val="single" w:sz="4" w:color="999999"/>
+              <w:bottom w:val="single" w:sz="4" w:color="999999"/>
+              <w:right w:val="single" w:sz="4" w:color="999999"/>
+            </w:tcBorders>
+          </w:tcPr>
+          <w:p>
+            <w:pPr>
+              <w:spacing w:before="20" w:after="20"/>
+            </w:pPr>
+            <w:r>
+              <w:rPr>
+                <w:sz w:val="17"/>
+              </w:rPr>
+            </w:r>
+            <w:r>
+              <w:rPr>
+                <w:b w:val="0"/>
+                <w:i w:val="0"/>
+                <w:sz w:val="17"/>
+              </w:rPr>
+              <w:t>Ensemble du manuel</w:t>
+            </w:r>
+          </w:p>
+        </w:tc>
+        <w:tc>
+          <w:tcPr>
+            <w:tcW w:type="dxa" w:w="4713"/>
+            <w:tcBorders>
+              <w:top w:val="single" w:sz="4" w:color="999999"/>
+              <w:left w:val="single" w:sz="4" w:color="999999"/>
+              <w:bottom w:val="single" w:sz="4" w:color="999999"/>
+              <w:right w:val="single" w:sz="4" w:color="999999"/>
+            </w:tcBorders>
+          </w:tcPr>
+          <w:p>
+            <w:pPr>
+              <w:spacing w:before="20" w:after="20"/>
+            </w:pPr>
+            <w:r>
+              <w:rPr>
+                <w:sz w:val="17"/>
+              </w:rPr>
+            </w:r>
+            <w:r>
+              <w:rPr>
+                <w:b w:val="0"/>
+                <w:i w:val="0"/>
+                <w:sz w:val="17"/>
+              </w:rPr>
+              <w:t>1</w:t>
             </w:r>
           </w:p>
         </w:tc>
@@ -7210,6 +7299,148 @@
                 <w:sz w:val="17"/>
               </w:rPr>
               <w:t>Une image approximative nuit plus qu'elle n'aide</w:t>
+            </w:r>
+          </w:p>
+        </w:tc>
+      </w:tr>
+      <w:tr>
+        <w:tc>
+          <w:tcPr>
+            <w:tcW w:type="dxa" w:w="3535"/>
+            <w:tcBorders>
+              <w:top w:val="single" w:sz="4" w:color="999999"/>
+              <w:left w:val="single" w:sz="4" w:color="999999"/>
+              <w:bottom w:val="single" w:sz="4" w:color="999999"/>
+              <w:right w:val="single" w:sz="4" w:color="999999"/>
+            </w:tcBorders>
+          </w:tcPr>
+          <w:p>
+            <w:pPr>
+              <w:spacing w:before="20" w:after="20"/>
+            </w:pPr>
+            <w:r>
+              <w:rPr>
+                <w:sz w:val="17"/>
+              </w:rPr>
+            </w:r>
+            <w:r>
+              <w:rPr>
+                <w:b/>
+                <w:i w:val="0"/>
+                <w:sz w:val="17"/>
+              </w:rPr>
+              <w:t>A10</w:t>
+            </w:r>
+          </w:p>
+        </w:tc>
+        <w:tc>
+          <w:tcPr>
+            <w:tcW w:type="dxa" w:w="3535"/>
+            <w:tcBorders>
+              <w:top w:val="single" w:sz="4" w:color="999999"/>
+              <w:left w:val="single" w:sz="4" w:color="999999"/>
+              <w:bottom w:val="single" w:sz="4" w:color="999999"/>
+              <w:right w:val="single" w:sz="4" w:color="999999"/>
+            </w:tcBorders>
+          </w:tcPr>
+          <w:p>
+            <w:pPr>
+              <w:spacing w:before="20" w:after="20"/>
+            </w:pPr>
+            <w:r>
+              <w:rPr>
+                <w:sz w:val="17"/>
+              </w:rPr>
+            </w:r>
+            <w:r>
+              <w:rPr>
+                <w:b/>
+                <w:i w:val="0"/>
+                <w:sz w:val="17"/>
+              </w:rPr>
+              <w:t>Tableau de répartition du volume horaire</w:t>
+            </w:r>
+            <w:r>
+              <w:rPr>
+                <w:b w:val="0"/>
+                <w:i w:val="0"/>
+                <w:sz w:val="17"/>
+              </w:rPr>
+              <w:t xml:space="preserve"> en tête de manuel</w:t>
+            </w:r>
+          </w:p>
+        </w:tc>
+        <w:tc>
+          <w:tcPr>
+            <w:tcW w:type="dxa" w:w="3535"/>
+            <w:tcBorders>
+              <w:top w:val="single" w:sz="4" w:color="999999"/>
+              <w:left w:val="single" w:sz="4" w:color="999999"/>
+              <w:bottom w:val="single" w:sz="4" w:color="999999"/>
+              <w:right w:val="single" w:sz="4" w:color="999999"/>
+            </w:tcBorders>
+          </w:tcPr>
+          <w:p>
+            <w:pPr>
+              <w:spacing w:before="20" w:after="20"/>
+            </w:pPr>
+            <w:r>
+              <w:rPr>
+                <w:sz w:val="17"/>
+              </w:rPr>
+            </w:r>
+            <w:r>
+              <w:rPr>
+                <w:b w:val="0"/>
+                <w:i w:val="0"/>
+                <w:sz w:val="17"/>
+              </w:rPr>
+              <w:t>Page de garde</w:t>
+            </w:r>
+          </w:p>
+        </w:tc>
+        <w:tc>
+          <w:tcPr>
+            <w:tcW w:type="dxa" w:w="3535"/>
+            <w:tcBorders>
+              <w:top w:val="single" w:sz="4" w:color="999999"/>
+              <w:left w:val="single" w:sz="4" w:color="999999"/>
+              <w:bottom w:val="single" w:sz="4" w:color="999999"/>
+              <w:right w:val="single" w:sz="4" w:color="999999"/>
+            </w:tcBorders>
+          </w:tcPr>
+          <w:p>
+            <w:pPr>
+              <w:spacing w:before="20" w:after="20"/>
+            </w:pPr>
+            <w:r>
+              <w:rPr>
+                <w:sz w:val="17"/>
+              </w:rPr>
+            </w:r>
+            <w:r>
+              <w:rPr>
+                <w:b w:val="0"/>
+                <w:i w:val="0"/>
+                <w:sz w:val="17"/>
+              </w:rPr>
+              <w:t xml:space="preserve">Le PE fixe 66 h pour 4 h hebdomadaires, mais le manuel compte 51 séances et laisse le champ Durée vide. L'audit relevait que le volume horaire « aurait dû être lu et réparti, pas éludé » — le reproche valait aussi pour cette réécriture. Un tableau donne désormais le temps moyen par séance et par unité (50 min à 1 h 35). </w:t>
+            </w:r>
+            <w:r>
+              <w:rPr>
+                <w:b/>
+                <w:i w:val="0"/>
+                <w:sz w:val="17"/>
+              </w:rPr>
+              <w:t>L'Unité I est la seule en déficit</w:t>
+            </w:r>
+            <w:r>
+              <w:rPr>
+                <w:b w:val="0"/>
+                <w:i w:val="0"/>
+                <w:sz w:val="17"/>
+              </w:rPr>
+              <w:t xml:space="preserve"> : 12 séances pour 10 h ; deux solutions concrètes sont proposées, sans jamais sacrifier l'examen</w:t>
             </w:r>
           </w:p>
         </w:tc>

</xml_diff>

<commit_message>
Corrections demandées : A4 portrait + Times New Roman (gabarit d'origine), suppression des mentions FRP/Fascicule, des annexes d'écarts et des '(ligne fusionnée)'
Co-authored-by: arena-agent <297053741+arena-agent@users.noreply.github.com>
</commit_message>
<xml_diff>
--- a/Note-de-synthese-ecarts-SVT-T9.docx
+++ b/Note-de-synthese-ecarts-SVT-T9.docx
@@ -277,14 +277,14 @@
         <w:tblLook w:firstColumn="1" w:firstRow="1" w:lastColumn="0" w:lastRow="0" w:noHBand="0" w:noVBand="1" w:val="04A0"/>
       </w:tblPr>
       <w:tblGrid>
-        <w:gridCol w:w="4713"/>
-        <w:gridCol w:w="4713"/>
-        <w:gridCol w:w="4713"/>
+        <w:gridCol w:w="3402"/>
+        <w:gridCol w:w="3402"/>
+        <w:gridCol w:w="3402"/>
       </w:tblGrid>
       <w:tr>
         <w:tc>
           <w:tcPr>
-            <w:tcW w:type="dxa" w:w="4713"/>
+            <w:tcW w:type="dxa" w:w="3402"/>
             <w:shd w:val="clear" w:fill="D9D9D9"/>
             <w:tcBorders>
               <w:top w:val="single" w:sz="4" w:color="999999"/>
@@ -314,7 +314,7 @@
         </w:tc>
         <w:tc>
           <w:tcPr>
-            <w:tcW w:type="dxa" w:w="4713"/>
+            <w:tcW w:type="dxa" w:w="3402"/>
             <w:shd w:val="clear" w:fill="D9D9D9"/>
             <w:tcBorders>
               <w:top w:val="single" w:sz="4" w:color="999999"/>
@@ -344,7 +344,7 @@
         </w:tc>
         <w:tc>
           <w:tcPr>
-            <w:tcW w:type="dxa" w:w="4713"/>
+            <w:tcW w:type="dxa" w:w="3402"/>
             <w:shd w:val="clear" w:fill="D9D9D9"/>
             <w:tcBorders>
               <w:top w:val="single" w:sz="4" w:color="999999"/>
@@ -376,7 +376,7 @@
       <w:tr>
         <w:tc>
           <w:tcPr>
-            <w:tcW w:type="dxa" w:w="4713"/>
+            <w:tcW w:type="dxa" w:w="3402"/>
             <w:tcBorders>
               <w:top w:val="single" w:sz="4" w:color="999999"/>
               <w:left w:val="single" w:sz="4" w:color="999999"/>
@@ -413,7 +413,7 @@
         </w:tc>
         <w:tc>
           <w:tcPr>
-            <w:tcW w:type="dxa" w:w="4713"/>
+            <w:tcW w:type="dxa" w:w="3402"/>
             <w:tcBorders>
               <w:top w:val="single" w:sz="4" w:color="999999"/>
               <w:left w:val="single" w:sz="4" w:color="999999"/>
@@ -442,7 +442,7 @@
         </w:tc>
         <w:tc>
           <w:tcPr>
-            <w:tcW w:type="dxa" w:w="4713"/>
+            <w:tcW w:type="dxa" w:w="3402"/>
             <w:tcBorders>
               <w:top w:val="single" w:sz="4" w:color="999999"/>
               <w:left w:val="single" w:sz="4" w:color="999999"/>
@@ -473,7 +473,7 @@
       <w:tr>
         <w:tc>
           <w:tcPr>
-            <w:tcW w:type="dxa" w:w="4713"/>
+            <w:tcW w:type="dxa" w:w="3402"/>
             <w:tcBorders>
               <w:top w:val="single" w:sz="4" w:color="999999"/>
               <w:left w:val="single" w:sz="4" w:color="999999"/>
@@ -510,7 +510,7 @@
         </w:tc>
         <w:tc>
           <w:tcPr>
-            <w:tcW w:type="dxa" w:w="4713"/>
+            <w:tcW w:type="dxa" w:w="3402"/>
             <w:tcBorders>
               <w:top w:val="single" w:sz="4" w:color="999999"/>
               <w:left w:val="single" w:sz="4" w:color="999999"/>
@@ -539,7 +539,7 @@
         </w:tc>
         <w:tc>
           <w:tcPr>
-            <w:tcW w:type="dxa" w:w="4713"/>
+            <w:tcW w:type="dxa" w:w="3402"/>
             <w:tcBorders>
               <w:top w:val="single" w:sz="4" w:color="999999"/>
               <w:left w:val="single" w:sz="4" w:color="999999"/>
@@ -570,7 +570,7 @@
       <w:tr>
         <w:tc>
           <w:tcPr>
-            <w:tcW w:type="dxa" w:w="4713"/>
+            <w:tcW w:type="dxa" w:w="3402"/>
             <w:tcBorders>
               <w:top w:val="single" w:sz="4" w:color="999999"/>
               <w:left w:val="single" w:sz="4" w:color="999999"/>
@@ -607,7 +607,7 @@
         </w:tc>
         <w:tc>
           <w:tcPr>
-            <w:tcW w:type="dxa" w:w="4713"/>
+            <w:tcW w:type="dxa" w:w="3402"/>
             <w:tcBorders>
               <w:top w:val="single" w:sz="4" w:color="999999"/>
               <w:left w:val="single" w:sz="4" w:color="999999"/>
@@ -636,7 +636,7 @@
         </w:tc>
         <w:tc>
           <w:tcPr>
-            <w:tcW w:type="dxa" w:w="4713"/>
+            <w:tcW w:type="dxa" w:w="3402"/>
             <w:tcBorders>
               <w:top w:val="single" w:sz="4" w:color="999999"/>
               <w:left w:val="single" w:sz="4" w:color="999999"/>
@@ -667,7 +667,7 @@
       <w:tr>
         <w:tc>
           <w:tcPr>
-            <w:tcW w:type="dxa" w:w="4713"/>
+            <w:tcW w:type="dxa" w:w="3402"/>
             <w:tcBorders>
               <w:top w:val="single" w:sz="4" w:color="999999"/>
               <w:left w:val="single" w:sz="4" w:color="999999"/>
@@ -704,7 +704,7 @@
         </w:tc>
         <w:tc>
           <w:tcPr>
-            <w:tcW w:type="dxa" w:w="4713"/>
+            <w:tcW w:type="dxa" w:w="3402"/>
             <w:tcBorders>
               <w:top w:val="single" w:sz="4" w:color="999999"/>
               <w:left w:val="single" w:sz="4" w:color="999999"/>
@@ -733,7 +733,7 @@
         </w:tc>
         <w:tc>
           <w:tcPr>
-            <w:tcW w:type="dxa" w:w="4713"/>
+            <w:tcW w:type="dxa" w:w="3402"/>
             <w:tcBorders>
               <w:top w:val="single" w:sz="4" w:color="999999"/>
               <w:left w:val="single" w:sz="4" w:color="999999"/>
@@ -764,7 +764,7 @@
       <w:tr>
         <w:tc>
           <w:tcPr>
-            <w:tcW w:type="dxa" w:w="4713"/>
+            <w:tcW w:type="dxa" w:w="3402"/>
             <w:tcBorders>
               <w:top w:val="single" w:sz="4" w:color="999999"/>
               <w:left w:val="single" w:sz="4" w:color="999999"/>
@@ -785,7 +785,7 @@
         </w:tc>
         <w:tc>
           <w:tcPr>
-            <w:tcW w:type="dxa" w:w="4713"/>
+            <w:tcW w:type="dxa" w:w="3402"/>
             <w:tcBorders>
               <w:top w:val="single" w:sz="4" w:color="999999"/>
               <w:left w:val="single" w:sz="4" w:color="999999"/>
@@ -814,7 +814,7 @@
         </w:tc>
         <w:tc>
           <w:tcPr>
-            <w:tcW w:type="dxa" w:w="4713"/>
+            <w:tcW w:type="dxa" w:w="3402"/>
             <w:tcBorders>
               <w:top w:val="single" w:sz="4" w:color="999999"/>
               <w:left w:val="single" w:sz="4" w:color="999999"/>
@@ -845,14 +845,14 @@
         <w:tblLook w:firstColumn="1" w:firstRow="1" w:lastColumn="0" w:lastRow="0" w:noHBand="0" w:noVBand="1" w:val="04A0"/>
       </w:tblPr>
       <w:tblGrid>
-        <w:gridCol w:w="4713"/>
-        <w:gridCol w:w="4713"/>
-        <w:gridCol w:w="4713"/>
+        <w:gridCol w:w="3402"/>
+        <w:gridCol w:w="3402"/>
+        <w:gridCol w:w="3402"/>
       </w:tblGrid>
       <w:tr>
         <w:tc>
           <w:tcPr>
-            <w:tcW w:type="dxa" w:w="4713"/>
+            <w:tcW w:type="dxa" w:w="3402"/>
             <w:shd w:val="clear" w:fill="D9D9D9"/>
             <w:tcBorders>
               <w:top w:val="single" w:sz="4" w:color="999999"/>
@@ -882,7 +882,7 @@
         </w:tc>
         <w:tc>
           <w:tcPr>
-            <w:tcW w:type="dxa" w:w="4713"/>
+            <w:tcW w:type="dxa" w:w="3402"/>
             <w:shd w:val="clear" w:fill="D9D9D9"/>
             <w:tcBorders>
               <w:top w:val="single" w:sz="4" w:color="999999"/>
@@ -912,7 +912,7 @@
         </w:tc>
         <w:tc>
           <w:tcPr>
-            <w:tcW w:type="dxa" w:w="4713"/>
+            <w:tcW w:type="dxa" w:w="3402"/>
             <w:shd w:val="clear" w:fill="D9D9D9"/>
             <w:tcBorders>
               <w:top w:val="single" w:sz="4" w:color="999999"/>
@@ -944,7 +944,7 @@
       <w:tr>
         <w:tc>
           <w:tcPr>
-            <w:tcW w:type="dxa" w:w="4713"/>
+            <w:tcW w:type="dxa" w:w="3402"/>
             <w:tcBorders>
               <w:top w:val="single" w:sz="4" w:color="999999"/>
               <w:left w:val="single" w:sz="4" w:color="999999"/>
@@ -973,7 +973,7 @@
         </w:tc>
         <w:tc>
           <w:tcPr>
-            <w:tcW w:type="dxa" w:w="4713"/>
+            <w:tcW w:type="dxa" w:w="3402"/>
             <w:tcBorders>
               <w:top w:val="single" w:sz="4" w:color="999999"/>
               <w:left w:val="single" w:sz="4" w:color="999999"/>
@@ -1002,7 +1002,7 @@
         </w:tc>
         <w:tc>
           <w:tcPr>
-            <w:tcW w:type="dxa" w:w="4713"/>
+            <w:tcW w:type="dxa" w:w="3402"/>
             <w:tcBorders>
               <w:top w:val="single" w:sz="4" w:color="999999"/>
               <w:left w:val="single" w:sz="4" w:color="999999"/>
@@ -1033,7 +1033,7 @@
       <w:tr>
         <w:tc>
           <w:tcPr>
-            <w:tcW w:type="dxa" w:w="4713"/>
+            <w:tcW w:type="dxa" w:w="3402"/>
             <w:tcBorders>
               <w:top w:val="single" w:sz="4" w:color="999999"/>
               <w:left w:val="single" w:sz="4" w:color="999999"/>
@@ -1062,7 +1062,7 @@
         </w:tc>
         <w:tc>
           <w:tcPr>
-            <w:tcW w:type="dxa" w:w="4713"/>
+            <w:tcW w:type="dxa" w:w="3402"/>
             <w:tcBorders>
               <w:top w:val="single" w:sz="4" w:color="999999"/>
               <w:left w:val="single" w:sz="4" w:color="999999"/>
@@ -1091,7 +1091,7 @@
         </w:tc>
         <w:tc>
           <w:tcPr>
-            <w:tcW w:type="dxa" w:w="4713"/>
+            <w:tcW w:type="dxa" w:w="3402"/>
             <w:tcBorders>
               <w:top w:val="single" w:sz="4" w:color="999999"/>
               <w:left w:val="single" w:sz="4" w:color="999999"/>
@@ -1122,7 +1122,7 @@
       <w:tr>
         <w:tc>
           <w:tcPr>
-            <w:tcW w:type="dxa" w:w="4713"/>
+            <w:tcW w:type="dxa" w:w="3402"/>
             <w:tcBorders>
               <w:top w:val="single" w:sz="4" w:color="999999"/>
               <w:left w:val="single" w:sz="4" w:color="999999"/>
@@ -1151,7 +1151,7 @@
         </w:tc>
         <w:tc>
           <w:tcPr>
-            <w:tcW w:type="dxa" w:w="4713"/>
+            <w:tcW w:type="dxa" w:w="3402"/>
             <w:tcBorders>
               <w:top w:val="single" w:sz="4" w:color="999999"/>
               <w:left w:val="single" w:sz="4" w:color="999999"/>
@@ -1180,7 +1180,7 @@
         </w:tc>
         <w:tc>
           <w:tcPr>
-            <w:tcW w:type="dxa" w:w="4713"/>
+            <w:tcW w:type="dxa" w:w="3402"/>
             <w:tcBorders>
               <w:top w:val="single" w:sz="4" w:color="999999"/>
               <w:left w:val="single" w:sz="4" w:color="999999"/>
@@ -1211,7 +1211,7 @@
       <w:tr>
         <w:tc>
           <w:tcPr>
-            <w:tcW w:type="dxa" w:w="4713"/>
+            <w:tcW w:type="dxa" w:w="3402"/>
             <w:tcBorders>
               <w:top w:val="single" w:sz="4" w:color="999999"/>
               <w:left w:val="single" w:sz="4" w:color="999999"/>
@@ -1240,7 +1240,7 @@
         </w:tc>
         <w:tc>
           <w:tcPr>
-            <w:tcW w:type="dxa" w:w="4713"/>
+            <w:tcW w:type="dxa" w:w="3402"/>
             <w:tcBorders>
               <w:top w:val="single" w:sz="4" w:color="999999"/>
               <w:left w:val="single" w:sz="4" w:color="999999"/>
@@ -1269,7 +1269,7 @@
         </w:tc>
         <w:tc>
           <w:tcPr>
-            <w:tcW w:type="dxa" w:w="4713"/>
+            <w:tcW w:type="dxa" w:w="3402"/>
             <w:tcBorders>
               <w:top w:val="single" w:sz="4" w:color="999999"/>
               <w:left w:val="single" w:sz="4" w:color="999999"/>
@@ -1300,7 +1300,7 @@
       <w:tr>
         <w:tc>
           <w:tcPr>
-            <w:tcW w:type="dxa" w:w="4713"/>
+            <w:tcW w:type="dxa" w:w="3402"/>
             <w:tcBorders>
               <w:top w:val="single" w:sz="4" w:color="999999"/>
               <w:left w:val="single" w:sz="4" w:color="999999"/>
@@ -1329,7 +1329,7 @@
         </w:tc>
         <w:tc>
           <w:tcPr>
-            <w:tcW w:type="dxa" w:w="4713"/>
+            <w:tcW w:type="dxa" w:w="3402"/>
             <w:tcBorders>
               <w:top w:val="single" w:sz="4" w:color="999999"/>
               <w:left w:val="single" w:sz="4" w:color="999999"/>
@@ -1358,7 +1358,7 @@
         </w:tc>
         <w:tc>
           <w:tcPr>
-            <w:tcW w:type="dxa" w:w="4713"/>
+            <w:tcW w:type="dxa" w:w="3402"/>
             <w:tcBorders>
               <w:top w:val="single" w:sz="4" w:color="999999"/>
               <w:left w:val="single" w:sz="4" w:color="999999"/>
@@ -1389,7 +1389,7 @@
       <w:tr>
         <w:tc>
           <w:tcPr>
-            <w:tcW w:type="dxa" w:w="4713"/>
+            <w:tcW w:type="dxa" w:w="3402"/>
             <w:tcBorders>
               <w:top w:val="single" w:sz="4" w:color="999999"/>
               <w:left w:val="single" w:sz="4" w:color="999999"/>
@@ -1418,7 +1418,7 @@
         </w:tc>
         <w:tc>
           <w:tcPr>
-            <w:tcW w:type="dxa" w:w="4713"/>
+            <w:tcW w:type="dxa" w:w="3402"/>
             <w:tcBorders>
               <w:top w:val="single" w:sz="4" w:color="999999"/>
               <w:left w:val="single" w:sz="4" w:color="999999"/>
@@ -1447,7 +1447,7 @@
         </w:tc>
         <w:tc>
           <w:tcPr>
-            <w:tcW w:type="dxa" w:w="4713"/>
+            <w:tcW w:type="dxa" w:w="3402"/>
             <w:tcBorders>
               <w:top w:val="single" w:sz="4" w:color="999999"/>
               <w:left w:val="single" w:sz="4" w:color="999999"/>
@@ -1478,7 +1478,7 @@
       <w:tr>
         <w:tc>
           <w:tcPr>
-            <w:tcW w:type="dxa" w:w="4713"/>
+            <w:tcW w:type="dxa" w:w="3402"/>
             <w:tcBorders>
               <w:top w:val="single" w:sz="4" w:color="999999"/>
               <w:left w:val="single" w:sz="4" w:color="999999"/>
@@ -1507,7 +1507,7 @@
         </w:tc>
         <w:tc>
           <w:tcPr>
-            <w:tcW w:type="dxa" w:w="4713"/>
+            <w:tcW w:type="dxa" w:w="3402"/>
             <w:tcBorders>
               <w:top w:val="single" w:sz="4" w:color="999999"/>
               <w:left w:val="single" w:sz="4" w:color="999999"/>
@@ -1536,7 +1536,7 @@
         </w:tc>
         <w:tc>
           <w:tcPr>
-            <w:tcW w:type="dxa" w:w="4713"/>
+            <w:tcW w:type="dxa" w:w="3402"/>
             <w:tcBorders>
               <w:top w:val="single" w:sz="4" w:color="999999"/>
               <w:left w:val="single" w:sz="4" w:color="999999"/>
@@ -1567,7 +1567,7 @@
       <w:tr>
         <w:tc>
           <w:tcPr>
-            <w:tcW w:type="dxa" w:w="4713"/>
+            <w:tcW w:type="dxa" w:w="3402"/>
             <w:tcBorders>
               <w:top w:val="single" w:sz="4" w:color="999999"/>
               <w:left w:val="single" w:sz="4" w:color="999999"/>
@@ -1596,7 +1596,7 @@
         </w:tc>
         <w:tc>
           <w:tcPr>
-            <w:tcW w:type="dxa" w:w="4713"/>
+            <w:tcW w:type="dxa" w:w="3402"/>
             <w:tcBorders>
               <w:top w:val="single" w:sz="4" w:color="999999"/>
               <w:left w:val="single" w:sz="4" w:color="999999"/>
@@ -1625,7 +1625,7 @@
         </w:tc>
         <w:tc>
           <w:tcPr>
-            <w:tcW w:type="dxa" w:w="4713"/>
+            <w:tcW w:type="dxa" w:w="3402"/>
             <w:tcBorders>
               <w:top w:val="single" w:sz="4" w:color="999999"/>
               <w:left w:val="single" w:sz="4" w:color="999999"/>
@@ -1829,14 +1829,14 @@
         <w:tblLook w:firstColumn="1" w:firstRow="1" w:lastColumn="0" w:lastRow="0" w:noHBand="0" w:noVBand="1" w:val="04A0"/>
       </w:tblPr>
       <w:tblGrid>
-        <w:gridCol w:w="4713"/>
-        <w:gridCol w:w="4713"/>
-        <w:gridCol w:w="4713"/>
+        <w:gridCol w:w="3402"/>
+        <w:gridCol w:w="3402"/>
+        <w:gridCol w:w="3402"/>
       </w:tblGrid>
       <w:tr>
         <w:tc>
           <w:tcPr>
-            <w:tcW w:type="dxa" w:w="4713"/>
+            <w:tcW w:type="dxa" w:w="3402"/>
             <w:shd w:val="clear" w:fill="D9D9D9"/>
             <w:tcBorders>
               <w:top w:val="single" w:sz="4" w:color="999999"/>
@@ -1858,7 +1858,7 @@
         </w:tc>
         <w:tc>
           <w:tcPr>
-            <w:tcW w:type="dxa" w:w="4713"/>
+            <w:tcW w:type="dxa" w:w="3402"/>
             <w:shd w:val="clear" w:fill="D9D9D9"/>
             <w:tcBorders>
               <w:top w:val="single" w:sz="4" w:color="999999"/>
@@ -1888,7 +1888,7 @@
         </w:tc>
         <w:tc>
           <w:tcPr>
-            <w:tcW w:type="dxa" w:w="4713"/>
+            <w:tcW w:type="dxa" w:w="3402"/>
             <w:shd w:val="clear" w:fill="D9D9D9"/>
             <w:tcBorders>
               <w:top w:val="single" w:sz="4" w:color="999999"/>
@@ -1920,7 +1920,7 @@
       <w:tr>
         <w:tc>
           <w:tcPr>
-            <w:tcW w:type="dxa" w:w="4713"/>
+            <w:tcW w:type="dxa" w:w="3402"/>
             <w:tcBorders>
               <w:top w:val="single" w:sz="4" w:color="999999"/>
               <w:left w:val="single" w:sz="4" w:color="999999"/>
@@ -1949,7 +1949,7 @@
         </w:tc>
         <w:tc>
           <w:tcPr>
-            <w:tcW w:type="dxa" w:w="4713"/>
+            <w:tcW w:type="dxa" w:w="3402"/>
             <w:tcBorders>
               <w:top w:val="single" w:sz="4" w:color="999999"/>
               <w:left w:val="single" w:sz="4" w:color="999999"/>
@@ -1978,7 +1978,7 @@
         </w:tc>
         <w:tc>
           <w:tcPr>
-            <w:tcW w:type="dxa" w:w="4713"/>
+            <w:tcW w:type="dxa" w:w="3402"/>
             <w:tcBorders>
               <w:top w:val="single" w:sz="4" w:color="999999"/>
               <w:left w:val="single" w:sz="4" w:color="999999"/>
@@ -2009,7 +2009,7 @@
       <w:tr>
         <w:tc>
           <w:tcPr>
-            <w:tcW w:type="dxa" w:w="4713"/>
+            <w:tcW w:type="dxa" w:w="3402"/>
             <w:tcBorders>
               <w:top w:val="single" w:sz="4" w:color="999999"/>
               <w:left w:val="single" w:sz="4" w:color="999999"/>
@@ -2038,7 +2038,7 @@
         </w:tc>
         <w:tc>
           <w:tcPr>
-            <w:tcW w:type="dxa" w:w="4713"/>
+            <w:tcW w:type="dxa" w:w="3402"/>
             <w:tcBorders>
               <w:top w:val="single" w:sz="4" w:color="999999"/>
               <w:left w:val="single" w:sz="4" w:color="999999"/>
@@ -2075,7 +2075,7 @@
         </w:tc>
         <w:tc>
           <w:tcPr>
-            <w:tcW w:type="dxa" w:w="4713"/>
+            <w:tcW w:type="dxa" w:w="3402"/>
             <w:tcBorders>
               <w:top w:val="single" w:sz="4" w:color="999999"/>
               <w:left w:val="single" w:sz="4" w:color="999999"/>
@@ -2114,7 +2114,7 @@
       <w:tr>
         <w:tc>
           <w:tcPr>
-            <w:tcW w:type="dxa" w:w="4713"/>
+            <w:tcW w:type="dxa" w:w="3402"/>
             <w:tcBorders>
               <w:top w:val="single" w:sz="4" w:color="999999"/>
               <w:left w:val="single" w:sz="4" w:color="999999"/>
@@ -2143,7 +2143,7 @@
         </w:tc>
         <w:tc>
           <w:tcPr>
-            <w:tcW w:type="dxa" w:w="4713"/>
+            <w:tcW w:type="dxa" w:w="3402"/>
             <w:tcBorders>
               <w:top w:val="single" w:sz="4" w:color="999999"/>
               <w:left w:val="single" w:sz="4" w:color="999999"/>
@@ -2188,7 +2188,7 @@
         </w:tc>
         <w:tc>
           <w:tcPr>
-            <w:tcW w:type="dxa" w:w="4713"/>
+            <w:tcW w:type="dxa" w:w="3402"/>
             <w:tcBorders>
               <w:top w:val="single" w:sz="4" w:color="999999"/>
               <w:left w:val="single" w:sz="4" w:color="999999"/>
@@ -2219,7 +2219,7 @@
       <w:tr>
         <w:tc>
           <w:tcPr>
-            <w:tcW w:type="dxa" w:w="4713"/>
+            <w:tcW w:type="dxa" w:w="3402"/>
             <w:tcBorders>
               <w:top w:val="single" w:sz="4" w:color="999999"/>
               <w:left w:val="single" w:sz="4" w:color="999999"/>
@@ -2248,7 +2248,7 @@
         </w:tc>
         <w:tc>
           <w:tcPr>
-            <w:tcW w:type="dxa" w:w="4713"/>
+            <w:tcW w:type="dxa" w:w="3402"/>
             <w:tcBorders>
               <w:top w:val="single" w:sz="4" w:color="999999"/>
               <w:left w:val="single" w:sz="4" w:color="999999"/>
@@ -2277,7 +2277,7 @@
         </w:tc>
         <w:tc>
           <w:tcPr>
-            <w:tcW w:type="dxa" w:w="4713"/>
+            <w:tcW w:type="dxa" w:w="3402"/>
             <w:tcBorders>
               <w:top w:val="single" w:sz="4" w:color="999999"/>
               <w:left w:val="single" w:sz="4" w:color="999999"/>
@@ -2308,7 +2308,7 @@
       <w:tr>
         <w:tc>
           <w:tcPr>
-            <w:tcW w:type="dxa" w:w="4713"/>
+            <w:tcW w:type="dxa" w:w="3402"/>
             <w:tcBorders>
               <w:top w:val="single" w:sz="4" w:color="999999"/>
               <w:left w:val="single" w:sz="4" w:color="999999"/>
@@ -2337,7 +2337,7 @@
         </w:tc>
         <w:tc>
           <w:tcPr>
-            <w:tcW w:type="dxa" w:w="4713"/>
+            <w:tcW w:type="dxa" w:w="3402"/>
             <w:tcBorders>
               <w:top w:val="single" w:sz="4" w:color="999999"/>
               <w:left w:val="single" w:sz="4" w:color="999999"/>
@@ -2366,7 +2366,7 @@
         </w:tc>
         <w:tc>
           <w:tcPr>
-            <w:tcW w:type="dxa" w:w="4713"/>
+            <w:tcW w:type="dxa" w:w="3402"/>
             <w:tcBorders>
               <w:top w:val="single" w:sz="4" w:color="999999"/>
               <w:left w:val="single" w:sz="4" w:color="999999"/>
@@ -3490,16 +3490,16 @@
         <w:tblLook w:firstColumn="1" w:firstRow="1" w:lastColumn="0" w:lastRow="0" w:noHBand="0" w:noVBand="1" w:val="04A0"/>
       </w:tblPr>
       <w:tblGrid>
-        <w:gridCol w:w="2828"/>
-        <w:gridCol w:w="2828"/>
-        <w:gridCol w:w="2828"/>
-        <w:gridCol w:w="2828"/>
-        <w:gridCol w:w="2828"/>
+        <w:gridCol w:w="2041"/>
+        <w:gridCol w:w="2041"/>
+        <w:gridCol w:w="2041"/>
+        <w:gridCol w:w="2041"/>
+        <w:gridCol w:w="2041"/>
       </w:tblGrid>
       <w:tr>
         <w:tc>
           <w:tcPr>
-            <w:tcW w:type="dxa" w:w="2828"/>
+            <w:tcW w:type="dxa" w:w="2041"/>
             <w:shd w:val="clear" w:fill="D9D9D9"/>
             <w:tcBorders>
               <w:top w:val="single" w:sz="4" w:color="999999"/>
@@ -3529,7 +3529,7 @@
         </w:tc>
         <w:tc>
           <w:tcPr>
-            <w:tcW w:type="dxa" w:w="2828"/>
+            <w:tcW w:type="dxa" w:w="2041"/>
             <w:shd w:val="clear" w:fill="D9D9D9"/>
             <w:tcBorders>
               <w:top w:val="single" w:sz="4" w:color="999999"/>
@@ -3559,7 +3559,7 @@
         </w:tc>
         <w:tc>
           <w:tcPr>
-            <w:tcW w:type="dxa" w:w="2828"/>
+            <w:tcW w:type="dxa" w:w="2041"/>
             <w:shd w:val="clear" w:fill="D9D9D9"/>
             <w:tcBorders>
               <w:top w:val="single" w:sz="4" w:color="999999"/>
@@ -3589,7 +3589,7 @@
         </w:tc>
         <w:tc>
           <w:tcPr>
-            <w:tcW w:type="dxa" w:w="2828"/>
+            <w:tcW w:type="dxa" w:w="2041"/>
             <w:shd w:val="clear" w:fill="D9D9D9"/>
             <w:tcBorders>
               <w:top w:val="single" w:sz="4" w:color="999999"/>
@@ -3619,7 +3619,7 @@
         </w:tc>
         <w:tc>
           <w:tcPr>
-            <w:tcW w:type="dxa" w:w="2828"/>
+            <w:tcW w:type="dxa" w:w="2041"/>
             <w:shd w:val="clear" w:fill="D9D9D9"/>
             <w:tcBorders>
               <w:top w:val="single" w:sz="4" w:color="999999"/>
@@ -3651,7 +3651,7 @@
       <w:tr>
         <w:tc>
           <w:tcPr>
-            <w:tcW w:type="dxa" w:w="2828"/>
+            <w:tcW w:type="dxa" w:w="2041"/>
             <w:tcBorders>
               <w:top w:val="single" w:sz="4" w:color="999999"/>
               <w:left w:val="single" w:sz="4" w:color="999999"/>
@@ -3680,7 +3680,7 @@
         </w:tc>
         <w:tc>
           <w:tcPr>
-            <w:tcW w:type="dxa" w:w="2828"/>
+            <w:tcW w:type="dxa" w:w="2041"/>
             <w:tcBorders>
               <w:top w:val="single" w:sz="4" w:color="999999"/>
               <w:left w:val="single" w:sz="4" w:color="999999"/>
@@ -3709,7 +3709,7 @@
         </w:tc>
         <w:tc>
           <w:tcPr>
-            <w:tcW w:type="dxa" w:w="2828"/>
+            <w:tcW w:type="dxa" w:w="2041"/>
             <w:tcBorders>
               <w:top w:val="single" w:sz="4" w:color="999999"/>
               <w:left w:val="single" w:sz="4" w:color="999999"/>
@@ -3738,7 +3738,7 @@
         </w:tc>
         <w:tc>
           <w:tcPr>
-            <w:tcW w:type="dxa" w:w="2828"/>
+            <w:tcW w:type="dxa" w:w="2041"/>
             <w:tcBorders>
               <w:top w:val="single" w:sz="4" w:color="999999"/>
               <w:left w:val="single" w:sz="4" w:color="999999"/>
@@ -3767,7 +3767,7 @@
         </w:tc>
         <w:tc>
           <w:tcPr>
-            <w:tcW w:type="dxa" w:w="2828"/>
+            <w:tcW w:type="dxa" w:w="2041"/>
             <w:tcBorders>
               <w:top w:val="single" w:sz="4" w:color="999999"/>
               <w:left w:val="single" w:sz="4" w:color="999999"/>
@@ -3814,7 +3814,7 @@
       <w:tr>
         <w:tc>
           <w:tcPr>
-            <w:tcW w:type="dxa" w:w="2828"/>
+            <w:tcW w:type="dxa" w:w="2041"/>
             <w:tcBorders>
               <w:top w:val="single" w:sz="4" w:color="999999"/>
               <w:left w:val="single" w:sz="4" w:color="999999"/>
@@ -3843,7 +3843,7 @@
         </w:tc>
         <w:tc>
           <w:tcPr>
-            <w:tcW w:type="dxa" w:w="2828"/>
+            <w:tcW w:type="dxa" w:w="2041"/>
             <w:tcBorders>
               <w:top w:val="single" w:sz="4" w:color="999999"/>
               <w:left w:val="single" w:sz="4" w:color="999999"/>
@@ -3872,7 +3872,7 @@
         </w:tc>
         <w:tc>
           <w:tcPr>
-            <w:tcW w:type="dxa" w:w="2828"/>
+            <w:tcW w:type="dxa" w:w="2041"/>
             <w:tcBorders>
               <w:top w:val="single" w:sz="4" w:color="999999"/>
               <w:left w:val="single" w:sz="4" w:color="999999"/>
@@ -3901,7 +3901,7 @@
         </w:tc>
         <w:tc>
           <w:tcPr>
-            <w:tcW w:type="dxa" w:w="2828"/>
+            <w:tcW w:type="dxa" w:w="2041"/>
             <w:tcBorders>
               <w:top w:val="single" w:sz="4" w:color="999999"/>
               <w:left w:val="single" w:sz="4" w:color="999999"/>
@@ -3930,7 +3930,7 @@
         </w:tc>
         <w:tc>
           <w:tcPr>
-            <w:tcW w:type="dxa" w:w="2828"/>
+            <w:tcW w:type="dxa" w:w="2041"/>
             <w:tcBorders>
               <w:top w:val="single" w:sz="4" w:color="999999"/>
               <w:left w:val="single" w:sz="4" w:color="999999"/>
@@ -3961,7 +3961,7 @@
       <w:tr>
         <w:tc>
           <w:tcPr>
-            <w:tcW w:type="dxa" w:w="2828"/>
+            <w:tcW w:type="dxa" w:w="2041"/>
             <w:tcBorders>
               <w:top w:val="single" w:sz="4" w:color="999999"/>
               <w:left w:val="single" w:sz="4" w:color="999999"/>
@@ -3990,7 +3990,7 @@
         </w:tc>
         <w:tc>
           <w:tcPr>
-            <w:tcW w:type="dxa" w:w="2828"/>
+            <w:tcW w:type="dxa" w:w="2041"/>
             <w:tcBorders>
               <w:top w:val="single" w:sz="4" w:color="999999"/>
               <w:left w:val="single" w:sz="4" w:color="999999"/>
@@ -4019,7 +4019,7 @@
         </w:tc>
         <w:tc>
           <w:tcPr>
-            <w:tcW w:type="dxa" w:w="2828"/>
+            <w:tcW w:type="dxa" w:w="2041"/>
             <w:tcBorders>
               <w:top w:val="single" w:sz="4" w:color="999999"/>
               <w:left w:val="single" w:sz="4" w:color="999999"/>
@@ -4048,7 +4048,7 @@
         </w:tc>
         <w:tc>
           <w:tcPr>
-            <w:tcW w:type="dxa" w:w="2828"/>
+            <w:tcW w:type="dxa" w:w="2041"/>
             <w:tcBorders>
               <w:top w:val="single" w:sz="4" w:color="999999"/>
               <w:left w:val="single" w:sz="4" w:color="999999"/>
@@ -4077,7 +4077,7 @@
         </w:tc>
         <w:tc>
           <w:tcPr>
-            <w:tcW w:type="dxa" w:w="2828"/>
+            <w:tcW w:type="dxa" w:w="2041"/>
             <w:tcBorders>
               <w:top w:val="single" w:sz="4" w:color="999999"/>
               <w:left w:val="single" w:sz="4" w:color="999999"/>
@@ -4124,7 +4124,7 @@
       <w:tr>
         <w:tc>
           <w:tcPr>
-            <w:tcW w:type="dxa" w:w="2828"/>
+            <w:tcW w:type="dxa" w:w="2041"/>
             <w:tcBorders>
               <w:top w:val="single" w:sz="4" w:color="999999"/>
               <w:left w:val="single" w:sz="4" w:color="999999"/>
@@ -4153,7 +4153,7 @@
         </w:tc>
         <w:tc>
           <w:tcPr>
-            <w:tcW w:type="dxa" w:w="2828"/>
+            <w:tcW w:type="dxa" w:w="2041"/>
             <w:tcBorders>
               <w:top w:val="single" w:sz="4" w:color="999999"/>
               <w:left w:val="single" w:sz="4" w:color="999999"/>
@@ -4182,7 +4182,7 @@
         </w:tc>
         <w:tc>
           <w:tcPr>
-            <w:tcW w:type="dxa" w:w="2828"/>
+            <w:tcW w:type="dxa" w:w="2041"/>
             <w:tcBorders>
               <w:top w:val="single" w:sz="4" w:color="999999"/>
               <w:left w:val="single" w:sz="4" w:color="999999"/>
@@ -4211,7 +4211,7 @@
         </w:tc>
         <w:tc>
           <w:tcPr>
-            <w:tcW w:type="dxa" w:w="2828"/>
+            <w:tcW w:type="dxa" w:w="2041"/>
             <w:tcBorders>
               <w:top w:val="single" w:sz="4" w:color="999999"/>
               <w:left w:val="single" w:sz="4" w:color="999999"/>
@@ -4240,7 +4240,7 @@
         </w:tc>
         <w:tc>
           <w:tcPr>
-            <w:tcW w:type="dxa" w:w="2828"/>
+            <w:tcW w:type="dxa" w:w="2041"/>
             <w:tcBorders>
               <w:top w:val="single" w:sz="4" w:color="999999"/>
               <w:left w:val="single" w:sz="4" w:color="999999"/>
@@ -4287,7 +4287,7 @@
       <w:tr>
         <w:tc>
           <w:tcPr>
-            <w:tcW w:type="dxa" w:w="2828"/>
+            <w:tcW w:type="dxa" w:w="2041"/>
             <w:tcBorders>
               <w:top w:val="single" w:sz="4" w:color="999999"/>
               <w:left w:val="single" w:sz="4" w:color="999999"/>
@@ -4316,7 +4316,7 @@
         </w:tc>
         <w:tc>
           <w:tcPr>
-            <w:tcW w:type="dxa" w:w="2828"/>
+            <w:tcW w:type="dxa" w:w="2041"/>
             <w:tcBorders>
               <w:top w:val="single" w:sz="4" w:color="999999"/>
               <w:left w:val="single" w:sz="4" w:color="999999"/>
@@ -4345,7 +4345,7 @@
         </w:tc>
         <w:tc>
           <w:tcPr>
-            <w:tcW w:type="dxa" w:w="2828"/>
+            <w:tcW w:type="dxa" w:w="2041"/>
             <w:tcBorders>
               <w:top w:val="single" w:sz="4" w:color="999999"/>
               <w:left w:val="single" w:sz="4" w:color="999999"/>
@@ -4374,7 +4374,7 @@
         </w:tc>
         <w:tc>
           <w:tcPr>
-            <w:tcW w:type="dxa" w:w="2828"/>
+            <w:tcW w:type="dxa" w:w="2041"/>
             <w:tcBorders>
               <w:top w:val="single" w:sz="4" w:color="999999"/>
               <w:left w:val="single" w:sz="4" w:color="999999"/>
@@ -4403,7 +4403,7 @@
         </w:tc>
         <w:tc>
           <w:tcPr>
-            <w:tcW w:type="dxa" w:w="2828"/>
+            <w:tcW w:type="dxa" w:w="2041"/>
             <w:tcBorders>
               <w:top w:val="single" w:sz="4" w:color="999999"/>
               <w:left w:val="single" w:sz="4" w:color="999999"/>
@@ -4450,7 +4450,7 @@
       <w:tr>
         <w:tc>
           <w:tcPr>
-            <w:tcW w:type="dxa" w:w="2828"/>
+            <w:tcW w:type="dxa" w:w="2041"/>
             <w:tcBorders>
               <w:top w:val="single" w:sz="4" w:color="999999"/>
               <w:left w:val="single" w:sz="4" w:color="999999"/>
@@ -4479,7 +4479,7 @@
         </w:tc>
         <w:tc>
           <w:tcPr>
-            <w:tcW w:type="dxa" w:w="2828"/>
+            <w:tcW w:type="dxa" w:w="2041"/>
             <w:tcBorders>
               <w:top w:val="single" w:sz="4" w:color="999999"/>
               <w:left w:val="single" w:sz="4" w:color="999999"/>
@@ -4508,7 +4508,7 @@
         </w:tc>
         <w:tc>
           <w:tcPr>
-            <w:tcW w:type="dxa" w:w="2828"/>
+            <w:tcW w:type="dxa" w:w="2041"/>
             <w:tcBorders>
               <w:top w:val="single" w:sz="4" w:color="999999"/>
               <w:left w:val="single" w:sz="4" w:color="999999"/>
@@ -4537,7 +4537,7 @@
         </w:tc>
         <w:tc>
           <w:tcPr>
-            <w:tcW w:type="dxa" w:w="2828"/>
+            <w:tcW w:type="dxa" w:w="2041"/>
             <w:tcBorders>
               <w:top w:val="single" w:sz="4" w:color="999999"/>
               <w:left w:val="single" w:sz="4" w:color="999999"/>
@@ -4566,7 +4566,7 @@
         </w:tc>
         <w:tc>
           <w:tcPr>
-            <w:tcW w:type="dxa" w:w="2828"/>
+            <w:tcW w:type="dxa" w:w="2041"/>
             <w:tcBorders>
               <w:top w:val="single" w:sz="4" w:color="999999"/>
               <w:left w:val="single" w:sz="4" w:color="999999"/>
@@ -4597,7 +4597,7 @@
       <w:tr>
         <w:tc>
           <w:tcPr>
-            <w:tcW w:type="dxa" w:w="2828"/>
+            <w:tcW w:type="dxa" w:w="2041"/>
             <w:tcBorders>
               <w:top w:val="single" w:sz="4" w:color="999999"/>
               <w:left w:val="single" w:sz="4" w:color="999999"/>
@@ -4626,7 +4626,7 @@
         </w:tc>
         <w:tc>
           <w:tcPr>
-            <w:tcW w:type="dxa" w:w="2828"/>
+            <w:tcW w:type="dxa" w:w="2041"/>
             <w:tcBorders>
               <w:top w:val="single" w:sz="4" w:color="999999"/>
               <w:left w:val="single" w:sz="4" w:color="999999"/>
@@ -4655,7 +4655,7 @@
         </w:tc>
         <w:tc>
           <w:tcPr>
-            <w:tcW w:type="dxa" w:w="2828"/>
+            <w:tcW w:type="dxa" w:w="2041"/>
             <w:tcBorders>
               <w:top w:val="single" w:sz="4" w:color="999999"/>
               <w:left w:val="single" w:sz="4" w:color="999999"/>
@@ -4684,7 +4684,7 @@
         </w:tc>
         <w:tc>
           <w:tcPr>
-            <w:tcW w:type="dxa" w:w="2828"/>
+            <w:tcW w:type="dxa" w:w="2041"/>
             <w:tcBorders>
               <w:top w:val="single" w:sz="4" w:color="999999"/>
               <w:left w:val="single" w:sz="4" w:color="999999"/>
@@ -4713,7 +4713,7 @@
         </w:tc>
         <w:tc>
           <w:tcPr>
-            <w:tcW w:type="dxa" w:w="2828"/>
+            <w:tcW w:type="dxa" w:w="2041"/>
             <w:tcBorders>
               <w:top w:val="single" w:sz="4" w:color="999999"/>
               <w:left w:val="single" w:sz="4" w:color="999999"/>
@@ -4744,7 +4744,7 @@
       <w:tr>
         <w:tc>
           <w:tcPr>
-            <w:tcW w:type="dxa" w:w="2828"/>
+            <w:tcW w:type="dxa" w:w="2041"/>
             <w:tcBorders>
               <w:top w:val="single" w:sz="4" w:color="999999"/>
               <w:left w:val="single" w:sz="4" w:color="999999"/>
@@ -4773,7 +4773,7 @@
         </w:tc>
         <w:tc>
           <w:tcPr>
-            <w:tcW w:type="dxa" w:w="2828"/>
+            <w:tcW w:type="dxa" w:w="2041"/>
             <w:tcBorders>
               <w:top w:val="single" w:sz="4" w:color="999999"/>
               <w:left w:val="single" w:sz="4" w:color="999999"/>
@@ -4802,7 +4802,7 @@
         </w:tc>
         <w:tc>
           <w:tcPr>
-            <w:tcW w:type="dxa" w:w="2828"/>
+            <w:tcW w:type="dxa" w:w="2041"/>
             <w:tcBorders>
               <w:top w:val="single" w:sz="4" w:color="999999"/>
               <w:left w:val="single" w:sz="4" w:color="999999"/>
@@ -4831,7 +4831,7 @@
         </w:tc>
         <w:tc>
           <w:tcPr>
-            <w:tcW w:type="dxa" w:w="2828"/>
+            <w:tcW w:type="dxa" w:w="2041"/>
             <w:tcBorders>
               <w:top w:val="single" w:sz="4" w:color="999999"/>
               <w:left w:val="single" w:sz="4" w:color="999999"/>
@@ -4860,7 +4860,7 @@
         </w:tc>
         <w:tc>
           <w:tcPr>
-            <w:tcW w:type="dxa" w:w="2828"/>
+            <w:tcW w:type="dxa" w:w="2041"/>
             <w:tcBorders>
               <w:top w:val="single" w:sz="4" w:color="999999"/>
               <w:left w:val="single" w:sz="4" w:color="999999"/>
@@ -4891,7 +4891,7 @@
       <w:tr>
         <w:tc>
           <w:tcPr>
-            <w:tcW w:type="dxa" w:w="2828"/>
+            <w:tcW w:type="dxa" w:w="2041"/>
             <w:tcBorders>
               <w:top w:val="single" w:sz="4" w:color="999999"/>
               <w:left w:val="single" w:sz="4" w:color="999999"/>
@@ -4920,7 +4920,7 @@
         </w:tc>
         <w:tc>
           <w:tcPr>
-            <w:tcW w:type="dxa" w:w="2828"/>
+            <w:tcW w:type="dxa" w:w="2041"/>
             <w:tcBorders>
               <w:top w:val="single" w:sz="4" w:color="999999"/>
               <w:left w:val="single" w:sz="4" w:color="999999"/>
@@ -4949,7 +4949,7 @@
         </w:tc>
         <w:tc>
           <w:tcPr>
-            <w:tcW w:type="dxa" w:w="2828"/>
+            <w:tcW w:type="dxa" w:w="2041"/>
             <w:tcBorders>
               <w:top w:val="single" w:sz="4" w:color="999999"/>
               <w:left w:val="single" w:sz="4" w:color="999999"/>
@@ -4978,7 +4978,7 @@
         </w:tc>
         <w:tc>
           <w:tcPr>
-            <w:tcW w:type="dxa" w:w="2828"/>
+            <w:tcW w:type="dxa" w:w="2041"/>
             <w:tcBorders>
               <w:top w:val="single" w:sz="4" w:color="999999"/>
               <w:left w:val="single" w:sz="4" w:color="999999"/>
@@ -5007,7 +5007,7 @@
         </w:tc>
         <w:tc>
           <w:tcPr>
-            <w:tcW w:type="dxa" w:w="2828"/>
+            <w:tcW w:type="dxa" w:w="2041"/>
             <w:tcBorders>
               <w:top w:val="single" w:sz="4" w:color="999999"/>
               <w:left w:val="single" w:sz="4" w:color="999999"/>
@@ -5038,7 +5038,7 @@
       <w:tr>
         <w:tc>
           <w:tcPr>
-            <w:tcW w:type="dxa" w:w="2828"/>
+            <w:tcW w:type="dxa" w:w="2041"/>
             <w:tcBorders>
               <w:top w:val="single" w:sz="4" w:color="999999"/>
               <w:left w:val="single" w:sz="4" w:color="999999"/>
@@ -5067,7 +5067,7 @@
         </w:tc>
         <w:tc>
           <w:tcPr>
-            <w:tcW w:type="dxa" w:w="2828"/>
+            <w:tcW w:type="dxa" w:w="2041"/>
             <w:tcBorders>
               <w:top w:val="single" w:sz="4" w:color="999999"/>
               <w:left w:val="single" w:sz="4" w:color="999999"/>
@@ -5096,7 +5096,7 @@
         </w:tc>
         <w:tc>
           <w:tcPr>
-            <w:tcW w:type="dxa" w:w="2828"/>
+            <w:tcW w:type="dxa" w:w="2041"/>
             <w:tcBorders>
               <w:top w:val="single" w:sz="4" w:color="999999"/>
               <w:left w:val="single" w:sz="4" w:color="999999"/>
@@ -5125,7 +5125,7 @@
         </w:tc>
         <w:tc>
           <w:tcPr>
-            <w:tcW w:type="dxa" w:w="2828"/>
+            <w:tcW w:type="dxa" w:w="2041"/>
             <w:tcBorders>
               <w:top w:val="single" w:sz="4" w:color="999999"/>
               <w:left w:val="single" w:sz="4" w:color="999999"/>
@@ -5154,7 +5154,7 @@
         </w:tc>
         <w:tc>
           <w:tcPr>
-            <w:tcW w:type="dxa" w:w="2828"/>
+            <w:tcW w:type="dxa" w:w="2041"/>
             <w:tcBorders>
               <w:top w:val="single" w:sz="4" w:color="999999"/>
               <w:left w:val="single" w:sz="4" w:color="999999"/>
@@ -5193,7 +5193,7 @@
       <w:tr>
         <w:tc>
           <w:tcPr>
-            <w:tcW w:type="dxa" w:w="2828"/>
+            <w:tcW w:type="dxa" w:w="2041"/>
             <w:tcBorders>
               <w:top w:val="single" w:sz="4" w:color="999999"/>
               <w:left w:val="single" w:sz="4" w:color="999999"/>
@@ -5222,7 +5222,7 @@
         </w:tc>
         <w:tc>
           <w:tcPr>
-            <w:tcW w:type="dxa" w:w="2828"/>
+            <w:tcW w:type="dxa" w:w="2041"/>
             <w:tcBorders>
               <w:top w:val="single" w:sz="4" w:color="999999"/>
               <w:left w:val="single" w:sz="4" w:color="999999"/>
@@ -5251,7 +5251,7 @@
         </w:tc>
         <w:tc>
           <w:tcPr>
-            <w:tcW w:type="dxa" w:w="2828"/>
+            <w:tcW w:type="dxa" w:w="2041"/>
             <w:tcBorders>
               <w:top w:val="single" w:sz="4" w:color="999999"/>
               <w:left w:val="single" w:sz="4" w:color="999999"/>
@@ -5280,7 +5280,7 @@
         </w:tc>
         <w:tc>
           <w:tcPr>
-            <w:tcW w:type="dxa" w:w="2828"/>
+            <w:tcW w:type="dxa" w:w="2041"/>
             <w:tcBorders>
               <w:top w:val="single" w:sz="4" w:color="999999"/>
               <w:left w:val="single" w:sz="4" w:color="999999"/>
@@ -5309,7 +5309,7 @@
         </w:tc>
         <w:tc>
           <w:tcPr>
-            <w:tcW w:type="dxa" w:w="2828"/>
+            <w:tcW w:type="dxa" w:w="2041"/>
             <w:tcBorders>
               <w:top w:val="single" w:sz="4" w:color="999999"/>
               <w:left w:val="single" w:sz="4" w:color="999999"/>
@@ -5340,7 +5340,7 @@
       <w:tr>
         <w:tc>
           <w:tcPr>
-            <w:tcW w:type="dxa" w:w="2828"/>
+            <w:tcW w:type="dxa" w:w="2041"/>
             <w:tcBorders>
               <w:top w:val="single" w:sz="4" w:color="999999"/>
               <w:left w:val="single" w:sz="4" w:color="999999"/>
@@ -5369,7 +5369,7 @@
         </w:tc>
         <w:tc>
           <w:tcPr>
-            <w:tcW w:type="dxa" w:w="2828"/>
+            <w:tcW w:type="dxa" w:w="2041"/>
             <w:tcBorders>
               <w:top w:val="single" w:sz="4" w:color="999999"/>
               <w:left w:val="single" w:sz="4" w:color="999999"/>
@@ -5398,7 +5398,7 @@
         </w:tc>
         <w:tc>
           <w:tcPr>
-            <w:tcW w:type="dxa" w:w="2828"/>
+            <w:tcW w:type="dxa" w:w="2041"/>
             <w:tcBorders>
               <w:top w:val="single" w:sz="4" w:color="999999"/>
               <w:left w:val="single" w:sz="4" w:color="999999"/>
@@ -5427,7 +5427,7 @@
         </w:tc>
         <w:tc>
           <w:tcPr>
-            <w:tcW w:type="dxa" w:w="2828"/>
+            <w:tcW w:type="dxa" w:w="2041"/>
             <w:tcBorders>
               <w:top w:val="single" w:sz="4" w:color="999999"/>
               <w:left w:val="single" w:sz="4" w:color="999999"/>
@@ -5456,7 +5456,7 @@
         </w:tc>
         <w:tc>
           <w:tcPr>
-            <w:tcW w:type="dxa" w:w="2828"/>
+            <w:tcW w:type="dxa" w:w="2041"/>
             <w:tcBorders>
               <w:top w:val="single" w:sz="4" w:color="999999"/>
               <w:left w:val="single" w:sz="4" w:color="999999"/>
@@ -5503,7 +5503,7 @@
       <w:tr>
         <w:tc>
           <w:tcPr>
-            <w:tcW w:type="dxa" w:w="2828"/>
+            <w:tcW w:type="dxa" w:w="2041"/>
             <w:tcBorders>
               <w:top w:val="single" w:sz="4" w:color="999999"/>
               <w:left w:val="single" w:sz="4" w:color="999999"/>
@@ -5532,7 +5532,7 @@
         </w:tc>
         <w:tc>
           <w:tcPr>
-            <w:tcW w:type="dxa" w:w="2828"/>
+            <w:tcW w:type="dxa" w:w="2041"/>
             <w:tcBorders>
               <w:top w:val="single" w:sz="4" w:color="999999"/>
               <w:left w:val="single" w:sz="4" w:color="999999"/>
@@ -5561,7 +5561,7 @@
         </w:tc>
         <w:tc>
           <w:tcPr>
-            <w:tcW w:type="dxa" w:w="2828"/>
+            <w:tcW w:type="dxa" w:w="2041"/>
             <w:tcBorders>
               <w:top w:val="single" w:sz="4" w:color="999999"/>
               <w:left w:val="single" w:sz="4" w:color="999999"/>
@@ -5590,7 +5590,7 @@
         </w:tc>
         <w:tc>
           <w:tcPr>
-            <w:tcW w:type="dxa" w:w="2828"/>
+            <w:tcW w:type="dxa" w:w="2041"/>
             <w:tcBorders>
               <w:top w:val="single" w:sz="4" w:color="999999"/>
               <w:left w:val="single" w:sz="4" w:color="999999"/>
@@ -5619,7 +5619,7 @@
         </w:tc>
         <w:tc>
           <w:tcPr>
-            <w:tcW w:type="dxa" w:w="2828"/>
+            <w:tcW w:type="dxa" w:w="2041"/>
             <w:tcBorders>
               <w:top w:val="single" w:sz="4" w:color="999999"/>
               <w:left w:val="single" w:sz="4" w:color="999999"/>
@@ -5666,7 +5666,7 @@
       <w:tr>
         <w:tc>
           <w:tcPr>
-            <w:tcW w:type="dxa" w:w="2828"/>
+            <w:tcW w:type="dxa" w:w="2041"/>
             <w:tcBorders>
               <w:top w:val="single" w:sz="4" w:color="999999"/>
               <w:left w:val="single" w:sz="4" w:color="999999"/>
@@ -5695,7 +5695,7 @@
         </w:tc>
         <w:tc>
           <w:tcPr>
-            <w:tcW w:type="dxa" w:w="2828"/>
+            <w:tcW w:type="dxa" w:w="2041"/>
             <w:tcBorders>
               <w:top w:val="single" w:sz="4" w:color="999999"/>
               <w:left w:val="single" w:sz="4" w:color="999999"/>
@@ -5724,7 +5724,7 @@
         </w:tc>
         <w:tc>
           <w:tcPr>
-            <w:tcW w:type="dxa" w:w="2828"/>
+            <w:tcW w:type="dxa" w:w="2041"/>
             <w:tcBorders>
               <w:top w:val="single" w:sz="4" w:color="999999"/>
               <w:left w:val="single" w:sz="4" w:color="999999"/>
@@ -5753,7 +5753,7 @@
         </w:tc>
         <w:tc>
           <w:tcPr>
-            <w:tcW w:type="dxa" w:w="2828"/>
+            <w:tcW w:type="dxa" w:w="2041"/>
             <w:tcBorders>
               <w:top w:val="single" w:sz="4" w:color="999999"/>
               <w:left w:val="single" w:sz="4" w:color="999999"/>
@@ -5782,7 +5782,7 @@
         </w:tc>
         <w:tc>
           <w:tcPr>
-            <w:tcW w:type="dxa" w:w="2828"/>
+            <w:tcW w:type="dxa" w:w="2041"/>
             <w:tcBorders>
               <w:top w:val="single" w:sz="4" w:color="999999"/>
               <w:left w:val="single" w:sz="4" w:color="999999"/>
@@ -5829,7 +5829,7 @@
       <w:tr>
         <w:tc>
           <w:tcPr>
-            <w:tcW w:type="dxa" w:w="2828"/>
+            <w:tcW w:type="dxa" w:w="2041"/>
             <w:tcBorders>
               <w:top w:val="single" w:sz="4" w:color="999999"/>
               <w:left w:val="single" w:sz="4" w:color="999999"/>
@@ -5858,7 +5858,7 @@
         </w:tc>
         <w:tc>
           <w:tcPr>
-            <w:tcW w:type="dxa" w:w="2828"/>
+            <w:tcW w:type="dxa" w:w="2041"/>
             <w:tcBorders>
               <w:top w:val="single" w:sz="4" w:color="999999"/>
               <w:left w:val="single" w:sz="4" w:color="999999"/>
@@ -5887,7 +5887,7 @@
         </w:tc>
         <w:tc>
           <w:tcPr>
-            <w:tcW w:type="dxa" w:w="2828"/>
+            <w:tcW w:type="dxa" w:w="2041"/>
             <w:tcBorders>
               <w:top w:val="single" w:sz="4" w:color="999999"/>
               <w:left w:val="single" w:sz="4" w:color="999999"/>
@@ -5916,7 +5916,7 @@
         </w:tc>
         <w:tc>
           <w:tcPr>
-            <w:tcW w:type="dxa" w:w="2828"/>
+            <w:tcW w:type="dxa" w:w="2041"/>
             <w:tcBorders>
               <w:top w:val="single" w:sz="4" w:color="999999"/>
               <w:left w:val="single" w:sz="4" w:color="999999"/>
@@ -5945,7 +5945,7 @@
         </w:tc>
         <w:tc>
           <w:tcPr>
-            <w:tcW w:type="dxa" w:w="2828"/>
+            <w:tcW w:type="dxa" w:w="2041"/>
             <w:tcBorders>
               <w:top w:val="single" w:sz="4" w:color="999999"/>
               <w:left w:val="single" w:sz="4" w:color="999999"/>
@@ -6037,15 +6037,15 @@
         <w:tblLook w:firstColumn="1" w:firstRow="1" w:lastColumn="0" w:lastRow="0" w:noHBand="0" w:noVBand="1" w:val="04A0"/>
       </w:tblPr>
       <w:tblGrid>
-        <w:gridCol w:w="3535"/>
-        <w:gridCol w:w="3535"/>
-        <w:gridCol w:w="3535"/>
-        <w:gridCol w:w="3535"/>
+        <w:gridCol w:w="2551"/>
+        <w:gridCol w:w="2551"/>
+        <w:gridCol w:w="2551"/>
+        <w:gridCol w:w="2551"/>
       </w:tblGrid>
       <w:tr>
         <w:tc>
           <w:tcPr>
-            <w:tcW w:type="dxa" w:w="3535"/>
+            <w:tcW w:type="dxa" w:w="2551"/>
             <w:shd w:val="clear" w:fill="D9D9D9"/>
             <w:tcBorders>
               <w:top w:val="single" w:sz="4" w:color="999999"/>
@@ -6075,7 +6075,7 @@
         </w:tc>
         <w:tc>
           <w:tcPr>
-            <w:tcW w:type="dxa" w:w="3535"/>
+            <w:tcW w:type="dxa" w:w="2551"/>
             <w:shd w:val="clear" w:fill="D9D9D9"/>
             <w:tcBorders>
               <w:top w:val="single" w:sz="4" w:color="999999"/>
@@ -6105,7 +6105,7 @@
         </w:tc>
         <w:tc>
           <w:tcPr>
-            <w:tcW w:type="dxa" w:w="3535"/>
+            <w:tcW w:type="dxa" w:w="2551"/>
             <w:shd w:val="clear" w:fill="D9D9D9"/>
             <w:tcBorders>
               <w:top w:val="single" w:sz="4" w:color="999999"/>
@@ -6135,7 +6135,7 @@
         </w:tc>
         <w:tc>
           <w:tcPr>
-            <w:tcW w:type="dxa" w:w="3535"/>
+            <w:tcW w:type="dxa" w:w="2551"/>
             <w:shd w:val="clear" w:fill="D9D9D9"/>
             <w:tcBorders>
               <w:top w:val="single" w:sz="4" w:color="999999"/>
@@ -6167,7 +6167,7 @@
       <w:tr>
         <w:tc>
           <w:tcPr>
-            <w:tcW w:type="dxa" w:w="3535"/>
+            <w:tcW w:type="dxa" w:w="2551"/>
             <w:tcBorders>
               <w:top w:val="single" w:sz="4" w:color="999999"/>
               <w:left w:val="single" w:sz="4" w:color="999999"/>
@@ -6196,7 +6196,7 @@
         </w:tc>
         <w:tc>
           <w:tcPr>
-            <w:tcW w:type="dxa" w:w="3535"/>
+            <w:tcW w:type="dxa" w:w="2551"/>
             <w:tcBorders>
               <w:top w:val="single" w:sz="4" w:color="999999"/>
               <w:left w:val="single" w:sz="4" w:color="999999"/>
@@ -6225,7 +6225,7 @@
         </w:tc>
         <w:tc>
           <w:tcPr>
-            <w:tcW w:type="dxa" w:w="3535"/>
+            <w:tcW w:type="dxa" w:w="2551"/>
             <w:tcBorders>
               <w:top w:val="single" w:sz="4" w:color="999999"/>
               <w:left w:val="single" w:sz="4" w:color="999999"/>
@@ -6254,7 +6254,7 @@
         </w:tc>
         <w:tc>
           <w:tcPr>
-            <w:tcW w:type="dxa" w:w="3535"/>
+            <w:tcW w:type="dxa" w:w="2551"/>
             <w:tcBorders>
               <w:top w:val="single" w:sz="4" w:color="999999"/>
               <w:left w:val="single" w:sz="4" w:color="999999"/>
@@ -6301,7 +6301,7 @@
       <w:tr>
         <w:tc>
           <w:tcPr>
-            <w:tcW w:type="dxa" w:w="3535"/>
+            <w:tcW w:type="dxa" w:w="2551"/>
             <w:tcBorders>
               <w:top w:val="single" w:sz="4" w:color="999999"/>
               <w:left w:val="single" w:sz="4" w:color="999999"/>
@@ -6330,7 +6330,7 @@
         </w:tc>
         <w:tc>
           <w:tcPr>
-            <w:tcW w:type="dxa" w:w="3535"/>
+            <w:tcW w:type="dxa" w:w="2551"/>
             <w:tcBorders>
               <w:top w:val="single" w:sz="4" w:color="999999"/>
               <w:left w:val="single" w:sz="4" w:color="999999"/>
@@ -6367,7 +6367,7 @@
         </w:tc>
         <w:tc>
           <w:tcPr>
-            <w:tcW w:type="dxa" w:w="3535"/>
+            <w:tcW w:type="dxa" w:w="2551"/>
             <w:tcBorders>
               <w:top w:val="single" w:sz="4" w:color="999999"/>
               <w:left w:val="single" w:sz="4" w:color="999999"/>
@@ -6396,7 +6396,7 @@
         </w:tc>
         <w:tc>
           <w:tcPr>
-            <w:tcW w:type="dxa" w:w="3535"/>
+            <w:tcW w:type="dxa" w:w="2551"/>
             <w:tcBorders>
               <w:top w:val="single" w:sz="4" w:color="999999"/>
               <w:left w:val="single" w:sz="4" w:color="999999"/>
@@ -6427,7 +6427,7 @@
       <w:tr>
         <w:tc>
           <w:tcPr>
-            <w:tcW w:type="dxa" w:w="3535"/>
+            <w:tcW w:type="dxa" w:w="2551"/>
             <w:tcBorders>
               <w:top w:val="single" w:sz="4" w:color="999999"/>
               <w:left w:val="single" w:sz="4" w:color="999999"/>
@@ -6456,7 +6456,7 @@
         </w:tc>
         <w:tc>
           <w:tcPr>
-            <w:tcW w:type="dxa" w:w="3535"/>
+            <w:tcW w:type="dxa" w:w="2551"/>
             <w:tcBorders>
               <w:top w:val="single" w:sz="4" w:color="999999"/>
               <w:left w:val="single" w:sz="4" w:color="999999"/>
@@ -6485,7 +6485,7 @@
         </w:tc>
         <w:tc>
           <w:tcPr>
-            <w:tcW w:type="dxa" w:w="3535"/>
+            <w:tcW w:type="dxa" w:w="2551"/>
             <w:tcBorders>
               <w:top w:val="single" w:sz="4" w:color="999999"/>
               <w:left w:val="single" w:sz="4" w:color="999999"/>
@@ -6514,7 +6514,7 @@
         </w:tc>
         <w:tc>
           <w:tcPr>
-            <w:tcW w:type="dxa" w:w="3535"/>
+            <w:tcW w:type="dxa" w:w="2551"/>
             <w:tcBorders>
               <w:top w:val="single" w:sz="4" w:color="999999"/>
               <w:left w:val="single" w:sz="4" w:color="999999"/>
@@ -6545,7 +6545,7 @@
       <w:tr>
         <w:tc>
           <w:tcPr>
-            <w:tcW w:type="dxa" w:w="3535"/>
+            <w:tcW w:type="dxa" w:w="2551"/>
             <w:tcBorders>
               <w:top w:val="single" w:sz="4" w:color="999999"/>
               <w:left w:val="single" w:sz="4" w:color="999999"/>
@@ -6574,7 +6574,7 @@
         </w:tc>
         <w:tc>
           <w:tcPr>
-            <w:tcW w:type="dxa" w:w="3535"/>
+            <w:tcW w:type="dxa" w:w="2551"/>
             <w:tcBorders>
               <w:top w:val="single" w:sz="4" w:color="999999"/>
               <w:left w:val="single" w:sz="4" w:color="999999"/>
@@ -6603,7 +6603,7 @@
         </w:tc>
         <w:tc>
           <w:tcPr>
-            <w:tcW w:type="dxa" w:w="3535"/>
+            <w:tcW w:type="dxa" w:w="2551"/>
             <w:tcBorders>
               <w:top w:val="single" w:sz="4" w:color="999999"/>
               <w:left w:val="single" w:sz="4" w:color="999999"/>
@@ -6632,7 +6632,7 @@
         </w:tc>
         <w:tc>
           <w:tcPr>
-            <w:tcW w:type="dxa" w:w="3535"/>
+            <w:tcW w:type="dxa" w:w="2551"/>
             <w:tcBorders>
               <w:top w:val="single" w:sz="4" w:color="999999"/>
               <w:left w:val="single" w:sz="4" w:color="999999"/>
@@ -6663,7 +6663,7 @@
       <w:tr>
         <w:tc>
           <w:tcPr>
-            <w:tcW w:type="dxa" w:w="3535"/>
+            <w:tcW w:type="dxa" w:w="2551"/>
             <w:tcBorders>
               <w:top w:val="single" w:sz="4" w:color="999999"/>
               <w:left w:val="single" w:sz="4" w:color="999999"/>
@@ -6692,7 +6692,7 @@
         </w:tc>
         <w:tc>
           <w:tcPr>
-            <w:tcW w:type="dxa" w:w="3535"/>
+            <w:tcW w:type="dxa" w:w="2551"/>
             <w:tcBorders>
               <w:top w:val="single" w:sz="4" w:color="999999"/>
               <w:left w:val="single" w:sz="4" w:color="999999"/>
@@ -6721,7 +6721,7 @@
         </w:tc>
         <w:tc>
           <w:tcPr>
-            <w:tcW w:type="dxa" w:w="3535"/>
+            <w:tcW w:type="dxa" w:w="2551"/>
             <w:tcBorders>
               <w:top w:val="single" w:sz="4" w:color="999999"/>
               <w:left w:val="single" w:sz="4" w:color="999999"/>
@@ -6750,7 +6750,7 @@
         </w:tc>
         <w:tc>
           <w:tcPr>
-            <w:tcW w:type="dxa" w:w="3535"/>
+            <w:tcW w:type="dxa" w:w="2551"/>
             <w:tcBorders>
               <w:top w:val="single" w:sz="4" w:color="999999"/>
               <w:left w:val="single" w:sz="4" w:color="999999"/>
@@ -6781,7 +6781,7 @@
       <w:tr>
         <w:tc>
           <w:tcPr>
-            <w:tcW w:type="dxa" w:w="3535"/>
+            <w:tcW w:type="dxa" w:w="2551"/>
             <w:tcBorders>
               <w:top w:val="single" w:sz="4" w:color="999999"/>
               <w:left w:val="single" w:sz="4" w:color="999999"/>
@@ -6810,7 +6810,7 @@
         </w:tc>
         <w:tc>
           <w:tcPr>
-            <w:tcW w:type="dxa" w:w="3535"/>
+            <w:tcW w:type="dxa" w:w="2551"/>
             <w:tcBorders>
               <w:top w:val="single" w:sz="4" w:color="999999"/>
               <w:left w:val="single" w:sz="4" w:color="999999"/>
@@ -6839,7 +6839,7 @@
         </w:tc>
         <w:tc>
           <w:tcPr>
-            <w:tcW w:type="dxa" w:w="3535"/>
+            <w:tcW w:type="dxa" w:w="2551"/>
             <w:tcBorders>
               <w:top w:val="single" w:sz="4" w:color="999999"/>
               <w:left w:val="single" w:sz="4" w:color="999999"/>
@@ -6868,7 +6868,7 @@
         </w:tc>
         <w:tc>
           <w:tcPr>
-            <w:tcW w:type="dxa" w:w="3535"/>
+            <w:tcW w:type="dxa" w:w="2551"/>
             <w:tcBorders>
               <w:top w:val="single" w:sz="4" w:color="999999"/>
               <w:left w:val="single" w:sz="4" w:color="999999"/>
@@ -6899,7 +6899,7 @@
       <w:tr>
         <w:tc>
           <w:tcPr>
-            <w:tcW w:type="dxa" w:w="3535"/>
+            <w:tcW w:type="dxa" w:w="2551"/>
             <w:tcBorders>
               <w:top w:val="single" w:sz="4" w:color="999999"/>
               <w:left w:val="single" w:sz="4" w:color="999999"/>
@@ -6928,7 +6928,7 @@
         </w:tc>
         <w:tc>
           <w:tcPr>
-            <w:tcW w:type="dxa" w:w="3535"/>
+            <w:tcW w:type="dxa" w:w="2551"/>
             <w:tcBorders>
               <w:top w:val="single" w:sz="4" w:color="999999"/>
               <w:left w:val="single" w:sz="4" w:color="999999"/>
@@ -6965,7 +6965,7 @@
         </w:tc>
         <w:tc>
           <w:tcPr>
-            <w:tcW w:type="dxa" w:w="3535"/>
+            <w:tcW w:type="dxa" w:w="2551"/>
             <w:tcBorders>
               <w:top w:val="single" w:sz="4" w:color="999999"/>
               <w:left w:val="single" w:sz="4" w:color="999999"/>
@@ -6994,7 +6994,7 @@
         </w:tc>
         <w:tc>
           <w:tcPr>
-            <w:tcW w:type="dxa" w:w="3535"/>
+            <w:tcW w:type="dxa" w:w="2551"/>
             <w:tcBorders>
               <w:top w:val="single" w:sz="4" w:color="999999"/>
               <w:left w:val="single" w:sz="4" w:color="999999"/>
@@ -7057,7 +7057,7 @@
       <w:tr>
         <w:tc>
           <w:tcPr>
-            <w:tcW w:type="dxa" w:w="3535"/>
+            <w:tcW w:type="dxa" w:w="2551"/>
             <w:tcBorders>
               <w:top w:val="single" w:sz="4" w:color="999999"/>
               <w:left w:val="single" w:sz="4" w:color="999999"/>
@@ -7086,7 +7086,7 @@
         </w:tc>
         <w:tc>
           <w:tcPr>
-            <w:tcW w:type="dxa" w:w="3535"/>
+            <w:tcW w:type="dxa" w:w="2551"/>
             <w:tcBorders>
               <w:top w:val="single" w:sz="4" w:color="999999"/>
               <w:left w:val="single" w:sz="4" w:color="999999"/>
@@ -7123,7 +7123,7 @@
         </w:tc>
         <w:tc>
           <w:tcPr>
-            <w:tcW w:type="dxa" w:w="3535"/>
+            <w:tcW w:type="dxa" w:w="2551"/>
             <w:tcBorders>
               <w:top w:val="single" w:sz="4" w:color="999999"/>
               <w:left w:val="single" w:sz="4" w:color="999999"/>
@@ -7152,7 +7152,7 @@
         </w:tc>
         <w:tc>
           <w:tcPr>
-            <w:tcW w:type="dxa" w:w="3535"/>
+            <w:tcW w:type="dxa" w:w="2551"/>
             <w:tcBorders>
               <w:top w:val="single" w:sz="4" w:color="999999"/>
               <w:left w:val="single" w:sz="4" w:color="999999"/>
@@ -7306,7 +7306,7 @@
       <w:tr>
         <w:tc>
           <w:tcPr>
-            <w:tcW w:type="dxa" w:w="3535"/>
+            <w:tcW w:type="dxa" w:w="2551"/>
             <w:tcBorders>
               <w:top w:val="single" w:sz="4" w:color="999999"/>
               <w:left w:val="single" w:sz="4" w:color="999999"/>
@@ -7335,7 +7335,7 @@
         </w:tc>
         <w:tc>
           <w:tcPr>
-            <w:tcW w:type="dxa" w:w="3535"/>
+            <w:tcW w:type="dxa" w:w="2551"/>
             <w:tcBorders>
               <w:top w:val="single" w:sz="4" w:color="999999"/>
               <w:left w:val="single" w:sz="4" w:color="999999"/>
@@ -7372,7 +7372,7 @@
         </w:tc>
         <w:tc>
           <w:tcPr>
-            <w:tcW w:type="dxa" w:w="3535"/>
+            <w:tcW w:type="dxa" w:w="2551"/>
             <w:tcBorders>
               <w:top w:val="single" w:sz="4" w:color="999999"/>
               <w:left w:val="single" w:sz="4" w:color="999999"/>
@@ -7401,7 +7401,7 @@
         </w:tc>
         <w:tc>
           <w:tcPr>
-            <w:tcW w:type="dxa" w:w="3535"/>
+            <w:tcW w:type="dxa" w:w="2551"/>
             <w:tcBorders>
               <w:top w:val="single" w:sz="4" w:color="999999"/>
               <w:left w:val="single" w:sz="4" w:color="999999"/>
@@ -7448,7 +7448,7 @@
       <w:tr>
         <w:tc>
           <w:tcPr>
-            <w:tcW w:type="dxa" w:w="3535"/>
+            <w:tcW w:type="dxa" w:w="2551"/>
             <w:tcBorders>
               <w:top w:val="single" w:sz="4" w:color="999999"/>
               <w:left w:val="single" w:sz="4" w:color="999999"/>
@@ -7477,7 +7477,7 @@
         </w:tc>
         <w:tc>
           <w:tcPr>
-            <w:tcW w:type="dxa" w:w="3535"/>
+            <w:tcW w:type="dxa" w:w="2551"/>
             <w:tcBorders>
               <w:top w:val="single" w:sz="4" w:color="999999"/>
               <w:left w:val="single" w:sz="4" w:color="999999"/>
@@ -7514,7 +7514,7 @@
         </w:tc>
         <w:tc>
           <w:tcPr>
-            <w:tcW w:type="dxa" w:w="3535"/>
+            <w:tcW w:type="dxa" w:w="2551"/>
             <w:tcBorders>
               <w:top w:val="single" w:sz="4" w:color="999999"/>
               <w:left w:val="single" w:sz="4" w:color="999999"/>
@@ -7543,7 +7543,7 @@
         </w:tc>
         <w:tc>
           <w:tcPr>
-            <w:tcW w:type="dxa" w:w="3535"/>
+            <w:tcW w:type="dxa" w:w="2551"/>
             <w:tcBorders>
               <w:top w:val="single" w:sz="4" w:color="999999"/>
               <w:left w:val="single" w:sz="4" w:color="999999"/>
@@ -7787,13 +7787,13 @@
         <w:tblLook w:firstColumn="1" w:firstRow="1" w:lastColumn="0" w:lastRow="0" w:noHBand="0" w:noVBand="1" w:val="04A0"/>
       </w:tblPr>
       <w:tblGrid>
-        <w:gridCol w:w="7070"/>
-        <w:gridCol w:w="7070"/>
+        <w:gridCol w:w="5103"/>
+        <w:gridCol w:w="5103"/>
       </w:tblGrid>
       <w:tr>
         <w:tc>
           <w:tcPr>
-            <w:tcW w:type="dxa" w:w="7070"/>
+            <w:tcW w:type="dxa" w:w="5103"/>
             <w:shd w:val="clear" w:fill="D9D9D9"/>
             <w:tcBorders>
               <w:top w:val="single" w:sz="4" w:color="999999"/>
@@ -7823,7 +7823,7 @@
         </w:tc>
         <w:tc>
           <w:tcPr>
-            <w:tcW w:type="dxa" w:w="7070"/>
+            <w:tcW w:type="dxa" w:w="5103"/>
             <w:shd w:val="clear" w:fill="D9D9D9"/>
             <w:tcBorders>
               <w:top w:val="single" w:sz="4" w:color="999999"/>
@@ -7855,7 +7855,7 @@
       <w:tr>
         <w:tc>
           <w:tcPr>
-            <w:tcW w:type="dxa" w:w="7070"/>
+            <w:tcW w:type="dxa" w:w="5103"/>
             <w:tcBorders>
               <w:top w:val="single" w:sz="4" w:color="999999"/>
               <w:left w:val="single" w:sz="4" w:color="999999"/>
@@ -7884,7 +7884,7 @@
         </w:tc>
         <w:tc>
           <w:tcPr>
-            <w:tcW w:type="dxa" w:w="7070"/>
+            <w:tcW w:type="dxa" w:w="5103"/>
             <w:tcBorders>
               <w:top w:val="single" w:sz="4" w:color="999999"/>
               <w:left w:val="single" w:sz="4" w:color="999999"/>
@@ -7915,7 +7915,7 @@
       <w:tr>
         <w:tc>
           <w:tcPr>
-            <w:tcW w:type="dxa" w:w="7070"/>
+            <w:tcW w:type="dxa" w:w="5103"/>
             <w:tcBorders>
               <w:top w:val="single" w:sz="4" w:color="999999"/>
               <w:left w:val="single" w:sz="4" w:color="999999"/>
@@ -7944,7 +7944,7 @@
         </w:tc>
         <w:tc>
           <w:tcPr>
-            <w:tcW w:type="dxa" w:w="7070"/>
+            <w:tcW w:type="dxa" w:w="5103"/>
             <w:tcBorders>
               <w:top w:val="single" w:sz="4" w:color="999999"/>
               <w:left w:val="single" w:sz="4" w:color="999999"/>
@@ -7975,7 +7975,7 @@
       <w:tr>
         <w:tc>
           <w:tcPr>
-            <w:tcW w:type="dxa" w:w="7070"/>
+            <w:tcW w:type="dxa" w:w="5103"/>
             <w:tcBorders>
               <w:top w:val="single" w:sz="4" w:color="999999"/>
               <w:left w:val="single" w:sz="4" w:color="999999"/>
@@ -8004,7 +8004,7 @@
         </w:tc>
         <w:tc>
           <w:tcPr>
-            <w:tcW w:type="dxa" w:w="7070"/>
+            <w:tcW w:type="dxa" w:w="5103"/>
             <w:tcBorders>
               <w:top w:val="single" w:sz="4" w:color="999999"/>
               <w:left w:val="single" w:sz="4" w:color="999999"/>
@@ -8035,7 +8035,7 @@
       <w:tr>
         <w:tc>
           <w:tcPr>
-            <w:tcW w:type="dxa" w:w="7070"/>
+            <w:tcW w:type="dxa" w:w="5103"/>
             <w:tcBorders>
               <w:top w:val="single" w:sz="4" w:color="999999"/>
               <w:left w:val="single" w:sz="4" w:color="999999"/>
@@ -8064,7 +8064,7 @@
         </w:tc>
         <w:tc>
           <w:tcPr>
-            <w:tcW w:type="dxa" w:w="7070"/>
+            <w:tcW w:type="dxa" w:w="5103"/>
             <w:tcBorders>
               <w:top w:val="single" w:sz="4" w:color="999999"/>
               <w:left w:val="single" w:sz="4" w:color="999999"/>
@@ -8095,7 +8095,7 @@
       <w:tr>
         <w:tc>
           <w:tcPr>
-            <w:tcW w:type="dxa" w:w="7070"/>
+            <w:tcW w:type="dxa" w:w="5103"/>
             <w:tcBorders>
               <w:top w:val="single" w:sz="4" w:color="999999"/>
               <w:left w:val="single" w:sz="4" w:color="999999"/>
@@ -8124,7 +8124,7 @@
         </w:tc>
         <w:tc>
           <w:tcPr>
-            <w:tcW w:type="dxa" w:w="7070"/>
+            <w:tcW w:type="dxa" w:w="5103"/>
             <w:tcBorders>
               <w:top w:val="single" w:sz="4" w:color="999999"/>
               <w:left w:val="single" w:sz="4" w:color="999999"/>
@@ -8155,7 +8155,7 @@
       <w:tr>
         <w:tc>
           <w:tcPr>
-            <w:tcW w:type="dxa" w:w="7070"/>
+            <w:tcW w:type="dxa" w:w="5103"/>
             <w:tcBorders>
               <w:top w:val="single" w:sz="4" w:color="999999"/>
               <w:left w:val="single" w:sz="4" w:color="999999"/>
@@ -8184,7 +8184,7 @@
         </w:tc>
         <w:tc>
           <w:tcPr>
-            <w:tcW w:type="dxa" w:w="7070"/>
+            <w:tcW w:type="dxa" w:w="5103"/>
             <w:tcBorders>
               <w:top w:val="single" w:sz="4" w:color="999999"/>
               <w:left w:val="single" w:sz="4" w:color="999999"/>
@@ -8404,14 +8404,14 @@
         <w:tblLook w:firstColumn="1" w:firstRow="1" w:lastColumn="0" w:lastRow="0" w:noHBand="0" w:noVBand="1" w:val="04A0"/>
       </w:tblPr>
       <w:tblGrid>
-        <w:gridCol w:w="4713"/>
-        <w:gridCol w:w="4713"/>
-        <w:gridCol w:w="4713"/>
+        <w:gridCol w:w="3402"/>
+        <w:gridCol w:w="3402"/>
+        <w:gridCol w:w="3402"/>
       </w:tblGrid>
       <w:tr>
         <w:tc>
           <w:tcPr>
-            <w:tcW w:type="dxa" w:w="4713"/>
+            <w:tcW w:type="dxa" w:w="3402"/>
             <w:shd w:val="clear" w:fill="D9D9D9"/>
             <w:tcBorders>
               <w:top w:val="single" w:sz="4" w:color="999999"/>
@@ -8441,7 +8441,7 @@
         </w:tc>
         <w:tc>
           <w:tcPr>
-            <w:tcW w:type="dxa" w:w="4713"/>
+            <w:tcW w:type="dxa" w:w="3402"/>
             <w:shd w:val="clear" w:fill="D9D9D9"/>
             <w:tcBorders>
               <w:top w:val="single" w:sz="4" w:color="999999"/>
@@ -8471,7 +8471,7 @@
         </w:tc>
         <w:tc>
           <w:tcPr>
-            <w:tcW w:type="dxa" w:w="4713"/>
+            <w:tcW w:type="dxa" w:w="3402"/>
             <w:shd w:val="clear" w:fill="D9D9D9"/>
             <w:tcBorders>
               <w:top w:val="single" w:sz="4" w:color="999999"/>
@@ -8503,7 +8503,7 @@
       <w:tr>
         <w:tc>
           <w:tcPr>
-            <w:tcW w:type="dxa" w:w="4713"/>
+            <w:tcW w:type="dxa" w:w="3402"/>
             <w:tcBorders>
               <w:top w:val="single" w:sz="4" w:color="999999"/>
               <w:left w:val="single" w:sz="4" w:color="999999"/>
@@ -8532,7 +8532,7 @@
         </w:tc>
         <w:tc>
           <w:tcPr>
-            <w:tcW w:type="dxa" w:w="4713"/>
+            <w:tcW w:type="dxa" w:w="3402"/>
             <w:tcBorders>
               <w:top w:val="single" w:sz="4" w:color="999999"/>
               <w:left w:val="single" w:sz="4" w:color="999999"/>
@@ -8561,7 +8561,7 @@
         </w:tc>
         <w:tc>
           <w:tcPr>
-            <w:tcW w:type="dxa" w:w="4713"/>
+            <w:tcW w:type="dxa" w:w="3402"/>
             <w:tcBorders>
               <w:top w:val="single" w:sz="4" w:color="999999"/>
               <w:left w:val="single" w:sz="4" w:color="999999"/>
@@ -8592,7 +8592,7 @@
       <w:tr>
         <w:tc>
           <w:tcPr>
-            <w:tcW w:type="dxa" w:w="4713"/>
+            <w:tcW w:type="dxa" w:w="3402"/>
             <w:tcBorders>
               <w:top w:val="single" w:sz="4" w:color="999999"/>
               <w:left w:val="single" w:sz="4" w:color="999999"/>
@@ -8621,7 +8621,7 @@
         </w:tc>
         <w:tc>
           <w:tcPr>
-            <w:tcW w:type="dxa" w:w="4713"/>
+            <w:tcW w:type="dxa" w:w="3402"/>
             <w:tcBorders>
               <w:top w:val="single" w:sz="4" w:color="999999"/>
               <w:left w:val="single" w:sz="4" w:color="999999"/>
@@ -8650,7 +8650,7 @@
         </w:tc>
         <w:tc>
           <w:tcPr>
-            <w:tcW w:type="dxa" w:w="4713"/>
+            <w:tcW w:type="dxa" w:w="3402"/>
             <w:tcBorders>
               <w:top w:val="single" w:sz="4" w:color="999999"/>
               <w:left w:val="single" w:sz="4" w:color="999999"/>
@@ -8689,7 +8689,7 @@
       <w:tr>
         <w:tc>
           <w:tcPr>
-            <w:tcW w:type="dxa" w:w="4713"/>
+            <w:tcW w:type="dxa" w:w="3402"/>
             <w:tcBorders>
               <w:top w:val="single" w:sz="4" w:color="999999"/>
               <w:left w:val="single" w:sz="4" w:color="999999"/>
@@ -8718,7 +8718,7 @@
         </w:tc>
         <w:tc>
           <w:tcPr>
-            <w:tcW w:type="dxa" w:w="4713"/>
+            <w:tcW w:type="dxa" w:w="3402"/>
             <w:tcBorders>
               <w:top w:val="single" w:sz="4" w:color="999999"/>
               <w:left w:val="single" w:sz="4" w:color="999999"/>
@@ -8747,7 +8747,7 @@
         </w:tc>
         <w:tc>
           <w:tcPr>
-            <w:tcW w:type="dxa" w:w="4713"/>
+            <w:tcW w:type="dxa" w:w="3402"/>
             <w:tcBorders>
               <w:top w:val="single" w:sz="4" w:color="999999"/>
               <w:left w:val="single" w:sz="4" w:color="999999"/>
@@ -8778,7 +8778,7 @@
       <w:tr>
         <w:tc>
           <w:tcPr>
-            <w:tcW w:type="dxa" w:w="4713"/>
+            <w:tcW w:type="dxa" w:w="3402"/>
             <w:tcBorders>
               <w:top w:val="single" w:sz="4" w:color="999999"/>
               <w:left w:val="single" w:sz="4" w:color="999999"/>
@@ -8807,7 +8807,7 @@
         </w:tc>
         <w:tc>
           <w:tcPr>
-            <w:tcW w:type="dxa" w:w="4713"/>
+            <w:tcW w:type="dxa" w:w="3402"/>
             <w:tcBorders>
               <w:top w:val="single" w:sz="4" w:color="999999"/>
               <w:left w:val="single" w:sz="4" w:color="999999"/>
@@ -8836,7 +8836,7 @@
         </w:tc>
         <w:tc>
           <w:tcPr>
-            <w:tcW w:type="dxa" w:w="4713"/>
+            <w:tcW w:type="dxa" w:w="3402"/>
             <w:tcBorders>
               <w:top w:val="single" w:sz="4" w:color="999999"/>
               <w:left w:val="single" w:sz="4" w:color="999999"/>
@@ -8867,7 +8867,7 @@
       <w:tr>
         <w:tc>
           <w:tcPr>
-            <w:tcW w:type="dxa" w:w="4713"/>
+            <w:tcW w:type="dxa" w:w="3402"/>
             <w:tcBorders>
               <w:top w:val="single" w:sz="4" w:color="999999"/>
               <w:left w:val="single" w:sz="4" w:color="999999"/>
@@ -8896,7 +8896,7 @@
         </w:tc>
         <w:tc>
           <w:tcPr>
-            <w:tcW w:type="dxa" w:w="4713"/>
+            <w:tcW w:type="dxa" w:w="3402"/>
             <w:tcBorders>
               <w:top w:val="single" w:sz="4" w:color="999999"/>
               <w:left w:val="single" w:sz="4" w:color="999999"/>
@@ -8925,7 +8925,7 @@
         </w:tc>
         <w:tc>
           <w:tcPr>
-            <w:tcW w:type="dxa" w:w="4713"/>
+            <w:tcW w:type="dxa" w:w="3402"/>
             <w:tcBorders>
               <w:top w:val="single" w:sz="4" w:color="999999"/>
               <w:left w:val="single" w:sz="4" w:color="999999"/>
@@ -8956,7 +8956,7 @@
       <w:tr>
         <w:tc>
           <w:tcPr>
-            <w:tcW w:type="dxa" w:w="4713"/>
+            <w:tcW w:type="dxa" w:w="3402"/>
             <w:tcBorders>
               <w:top w:val="single" w:sz="4" w:color="999999"/>
               <w:left w:val="single" w:sz="4" w:color="999999"/>
@@ -8985,7 +8985,7 @@
         </w:tc>
         <w:tc>
           <w:tcPr>
-            <w:tcW w:type="dxa" w:w="4713"/>
+            <w:tcW w:type="dxa" w:w="3402"/>
             <w:tcBorders>
               <w:top w:val="single" w:sz="4" w:color="999999"/>
               <w:left w:val="single" w:sz="4" w:color="999999"/>
@@ -9014,7 +9014,7 @@
         </w:tc>
         <w:tc>
           <w:tcPr>
-            <w:tcW w:type="dxa" w:w="4713"/>
+            <w:tcW w:type="dxa" w:w="3402"/>
             <w:tcBorders>
               <w:top w:val="single" w:sz="4" w:color="999999"/>
               <w:left w:val="single" w:sz="4" w:color="999999"/>
@@ -9045,7 +9045,7 @@
       <w:tr>
         <w:tc>
           <w:tcPr>
-            <w:tcW w:type="dxa" w:w="4713"/>
+            <w:tcW w:type="dxa" w:w="3402"/>
             <w:tcBorders>
               <w:top w:val="single" w:sz="4" w:color="999999"/>
               <w:left w:val="single" w:sz="4" w:color="999999"/>
@@ -9074,7 +9074,7 @@
         </w:tc>
         <w:tc>
           <w:tcPr>
-            <w:tcW w:type="dxa" w:w="4713"/>
+            <w:tcW w:type="dxa" w:w="3402"/>
             <w:tcBorders>
               <w:top w:val="single" w:sz="4" w:color="999999"/>
               <w:left w:val="single" w:sz="4" w:color="999999"/>
@@ -9103,7 +9103,7 @@
         </w:tc>
         <w:tc>
           <w:tcPr>
-            <w:tcW w:type="dxa" w:w="4713"/>
+            <w:tcW w:type="dxa" w:w="3402"/>
             <w:tcBorders>
               <w:top w:val="single" w:sz="4" w:color="999999"/>
               <w:left w:val="single" w:sz="4" w:color="999999"/>
@@ -9218,8 +9218,8 @@
       </w:r>
     </w:p>
     <w:sectPr>
-      <w:pgSz w:w="15840" w:h="12240" w:orient="landscape"/>
-      <w:pgMar w:top="850" w:right="850" w:bottom="850" w:left="850" w:header="720" w:footer="720" w:gutter="0"/>
+      <w:pgSz w:w="11906" w:h="16838"/>
+      <w:pgMar w:top="1020" w:right="850" w:bottom="1020" w:left="850" w:header="720" w:footer="720" w:gutter="0"/>
       <w:cols w:space="720"/>
       <w:docGrid w:linePitch="360"/>
     </w:sectPr>
@@ -9591,8 +9591,8 @@
     <w:qFormat/>
     <w:rsid w:val="00FC693F"/>
     <w:rPr>
-      <w:rFonts w:ascii="Calibri" w:hAnsi="Calibri"/>
-      <w:sz w:val="21"/>
+      <w:rFonts w:ascii="Times New Roman" w:hAnsi="Times New Roman" w:cs="Times New Roman" w:eastAsia="Times New Roman"/>
+      <w:sz w:val="22"/>
     </w:rPr>
   </w:style>
   <w:style w:type="paragraph" w:styleId="Header">

</xml_diff>